<commit_message>
docs(benchmark2.1): update summary report docx and pdf documents
</commit_message>
<xml_diff>
--- a/docs/Panduan Penelitian/model-comparing/benchmark2.1/Ringkasan laporan perbandingan model.docx
+++ b/docs/Panduan Penelitian/model-comparing/benchmark2.1/Ringkasan laporan perbandingan model.docx
@@ -4,7 +4,7 @@
   <w:body>
     <w:p>
       <w:pPr>
-        <w:pStyle w:val="867"/>
+        <w:pStyle w:val="929"/>
         <w:pBdr/>
         <w:spacing/>
         <w:ind/>
@@ -15,7 +15,16 @@
       <w:r>
         <w:t xml:space="preserve">PENDAHULUAN</w:t>
       </w:r>
-      <w:r/>
+      <w:r>
+        <w:rPr>
+          <w14:ligatures w14:val="none"/>
+        </w:rPr>
+      </w:r>
+      <w:r>
+        <w:rPr>
+          <w14:ligatures w14:val="none"/>
+        </w:rPr>
+      </w:r>
     </w:p>
     <w:p>
       <w:pPr>
@@ -57,7 +66,7 @@
     </w:p>
     <w:p>
       <w:pPr>
-        <w:pStyle w:val="930"/>
+        <w:pStyle w:val="992"/>
         <w:numPr>
           <w:ilvl w:val="0"/>
           <w:numId w:val="40"/>
@@ -110,7 +119,7 @@
     </w:p>
     <w:p>
       <w:pPr>
-        <w:pStyle w:val="930"/>
+        <w:pStyle w:val="992"/>
         <w:numPr>
           <w:ilvl w:val="0"/>
           <w:numId w:val="40"/>
@@ -163,7 +172,7 @@
     </w:p>
     <w:p>
       <w:pPr>
-        <w:pStyle w:val="930"/>
+        <w:pStyle w:val="992"/>
         <w:numPr>
           <w:ilvl w:val="0"/>
           <w:numId w:val="40"/>
@@ -216,7 +225,7 @@
     </w:p>
     <w:p>
       <w:pPr>
-        <w:pStyle w:val="930"/>
+        <w:pStyle w:val="992"/>
         <w:numPr>
           <w:ilvl w:val="0"/>
           <w:numId w:val="40"/>
@@ -252,7 +261,7 @@
     </w:p>
     <w:p>
       <w:pPr>
-        <w:pStyle w:val="930"/>
+        <w:pStyle w:val="992"/>
         <w:numPr>
           <w:ilvl w:val="0"/>
           <w:numId w:val="40"/>
@@ -288,7 +297,7 @@
     </w:p>
     <w:p>
       <w:pPr>
-        <w:pStyle w:val="930"/>
+        <w:pStyle w:val="992"/>
         <w:numPr>
           <w:ilvl w:val="0"/>
           <w:numId w:val="40"/>
@@ -444,7 +453,7 @@
     </w:p>
     <w:p>
       <w:pPr>
-        <w:pStyle w:val="930"/>
+        <w:pStyle w:val="992"/>
         <w:numPr>
           <w:ilvl w:val="0"/>
           <w:numId w:val="41"/>
@@ -541,7 +550,7 @@
     </w:p>
     <w:p>
       <w:pPr>
-        <w:pStyle w:val="930"/>
+        <w:pStyle w:val="992"/>
         <w:numPr>
           <w:ilvl w:val="0"/>
           <w:numId w:val="41"/>
@@ -630,7 +639,7 @@
     </w:p>
     <w:p>
       <w:pPr>
-        <w:pStyle w:val="930"/>
+        <w:pStyle w:val="992"/>
         <w:numPr>
           <w:ilvl w:val="0"/>
           <w:numId w:val="41"/>
@@ -805,7 +814,7 @@
     </w:p>
     <w:p>
       <w:pPr>
-        <w:pStyle w:val="930"/>
+        <w:pStyle w:val="992"/>
         <w:numPr>
           <w:ilvl w:val="0"/>
           <w:numId w:val="42"/>
@@ -850,7 +859,7 @@
     </w:p>
     <w:p>
       <w:pPr>
-        <w:pStyle w:val="930"/>
+        <w:pStyle w:val="992"/>
         <w:numPr>
           <w:ilvl w:val="0"/>
           <w:numId w:val="42"/>
@@ -895,7 +904,7 @@
     </w:p>
     <w:p>
       <w:pPr>
-        <w:pStyle w:val="930"/>
+        <w:pStyle w:val="992"/>
         <w:numPr>
           <w:ilvl w:val="0"/>
           <w:numId w:val="42"/>
@@ -940,7 +949,7 @@
     </w:p>
     <w:p>
       <w:pPr>
-        <w:pStyle w:val="930"/>
+        <w:pStyle w:val="992"/>
         <w:numPr>
           <w:ilvl w:val="0"/>
           <w:numId w:val="42"/>
@@ -985,7 +994,7 @@
     </w:p>
     <w:p>
       <w:pPr>
-        <w:pStyle w:val="930"/>
+        <w:pStyle w:val="992"/>
         <w:numPr>
           <w:ilvl w:val="0"/>
           <w:numId w:val="42"/>
@@ -1030,7 +1039,7 @@
     </w:p>
     <w:p>
       <w:pPr>
-        <w:pStyle w:val="930"/>
+        <w:pStyle w:val="992"/>
         <w:numPr>
           <w:ilvl w:val="0"/>
           <w:numId w:val="42"/>
@@ -1075,7 +1084,7 @@
     </w:p>
     <w:p>
       <w:pPr>
-        <w:pStyle w:val="930"/>
+        <w:pStyle w:val="992"/>
         <w:numPr>
           <w:ilvl w:val="0"/>
           <w:numId w:val="42"/>
@@ -1120,7 +1129,7 @@
     </w:p>
     <w:p>
       <w:pPr>
-        <w:pStyle w:val="930"/>
+        <w:pStyle w:val="992"/>
         <w:numPr>
           <w:ilvl w:val="0"/>
           <w:numId w:val="42"/>
@@ -1181,13 +1190,13 @@
           <w:color w:val="000000"/>
           <w:sz w:val="24"/>
         </w:rPr>
-        <w:t xml:space="preserve">Kontribusi utama naskah ini adalah:</w:t>
+        <w:t xml:space="preserve">Tujuan utama naskah ini adalah:</w:t>
       </w:r>
       <w:r/>
     </w:p>
     <w:p>
       <w:pPr>
-        <w:pStyle w:val="930"/>
+        <w:pStyle w:val="992"/>
         <w:numPr>
           <w:ilvl w:val="0"/>
           <w:numId w:val="43"/>
@@ -1248,7 +1257,7 @@
     </w:p>
     <w:p>
       <w:pPr>
-        <w:pStyle w:val="930"/>
+        <w:pStyle w:val="992"/>
         <w:numPr>
           <w:ilvl w:val="0"/>
           <w:numId w:val="43"/>
@@ -1292,7 +1301,7 @@
     </w:p>
     <w:p>
       <w:pPr>
-        <w:pStyle w:val="930"/>
+        <w:pStyle w:val="992"/>
         <w:numPr>
           <w:ilvl w:val="0"/>
           <w:numId w:val="43"/>
@@ -1370,7 +1379,7 @@
     </w:p>
     <w:p>
       <w:pPr>
-        <w:pStyle w:val="930"/>
+        <w:pStyle w:val="992"/>
         <w:numPr>
           <w:ilvl w:val="0"/>
           <w:numId w:val="43"/>
@@ -1399,11 +1408,12 @@
           <w:sz w:val="24"/>
         </w:rPr>
       </w:r>
+      <w:r/>
     </w:p>
     <w:p>
       <w:pPr>
         <w:pBdr/>
-        <w:shd w:val="nil"/>
+        <w:shd w:val="nil" w:color="auto"/>
         <w:spacing/>
         <w:ind/>
         <w:rPr>
@@ -1437,7 +1447,7 @@
     </w:p>
     <w:p>
       <w:pPr>
-        <w:pStyle w:val="867"/>
+        <w:pStyle w:val="929"/>
         <w:pBdr/>
         <w:spacing/>
         <w:ind/>
@@ -1448,22 +1458,40 @@
       <w:r>
         <w:t xml:space="preserve">METODOLOGI PENELITIAN</w:t>
       </w:r>
-      <w:r/>
-    </w:p>
-    <w:p>
-      <w:pPr>
-        <w:pStyle w:val="868"/>
-        <w:pBdr/>
-        <w:spacing/>
-        <w:ind/>
+      <w:r>
         <w:rPr>
           <w14:ligatures w14:val="none"/>
         </w:rPr>
+      </w:r>
+      <w:r>
+        <w:rPr>
+          <w14:ligatures w14:val="none"/>
+        </w:rPr>
+      </w:r>
+    </w:p>
+    <w:p>
+      <w:pPr>
+        <w:pStyle w:val="930"/>
+        <w:pBdr/>
+        <w:spacing/>
+        <w:ind/>
+        <w:rPr>
+          <w14:ligatures w14:val="none"/>
+        </w:rPr>
       </w:pPr>
       <w:r>
         <w:t xml:space="preserve">2.1 Kerangka Kerja Eksperimen</w:t>
       </w:r>
-      <w:r/>
+      <w:r>
+        <w:rPr>
+          <w14:ligatures w14:val="none"/>
+        </w:rPr>
+      </w:r>
+      <w:r>
+        <w:rPr>
+          <w14:ligatures w14:val="none"/>
+        </w:rPr>
+      </w:r>
     </w:p>
     <w:p>
       <w:pPr>
@@ -1506,7 +1534,7 @@
     </w:p>
     <w:p>
       <w:pPr>
-        <w:pStyle w:val="930"/>
+        <w:pStyle w:val="992"/>
         <w:numPr>
           <w:ilvl w:val="0"/>
           <w:numId w:val="44"/>
@@ -1592,7 +1620,7 @@
     </w:p>
     <w:p>
       <w:pPr>
-        <w:pStyle w:val="930"/>
+        <w:pStyle w:val="992"/>
         <w:numPr>
           <w:ilvl w:val="0"/>
           <w:numId w:val="44"/>
@@ -1757,7 +1785,7 @@
     </w:p>
     <w:p>
       <w:pPr>
-        <w:pStyle w:val="930"/>
+        <w:pStyle w:val="992"/>
         <w:numPr>
           <w:ilvl w:val="0"/>
           <w:numId w:val="44"/>
@@ -1810,7 +1838,7 @@
     </w:p>
     <w:p>
       <w:pPr>
-        <w:pStyle w:val="930"/>
+        <w:pStyle w:val="992"/>
         <w:numPr>
           <w:ilvl w:val="1"/>
           <w:numId w:val="44"/>
@@ -1907,7 +1935,7 @@
     </w:p>
     <w:p>
       <w:pPr>
-        <w:pStyle w:val="930"/>
+        <w:pStyle w:val="992"/>
         <w:numPr>
           <w:ilvl w:val="1"/>
           <w:numId w:val="44"/>
@@ -1987,7 +2015,7 @@
     </w:p>
     <w:p>
       <w:pPr>
-        <w:pStyle w:val="930"/>
+        <w:pStyle w:val="992"/>
         <w:numPr>
           <w:ilvl w:val="1"/>
           <w:numId w:val="44"/>
@@ -2040,7 +2068,7 @@
     </w:p>
     <w:p>
       <w:pPr>
-        <w:pStyle w:val="930"/>
+        <w:pStyle w:val="992"/>
         <w:numPr>
           <w:ilvl w:val="0"/>
           <w:numId w:val="44"/>
@@ -2127,7 +2155,7 @@
     </w:p>
     <w:p>
       <w:pPr>
-        <w:pStyle w:val="930"/>
+        <w:pStyle w:val="992"/>
         <w:numPr>
           <w:ilvl w:val="0"/>
           <w:numId w:val="44"/>
@@ -2165,6 +2193,7 @@
           <w:sz w:val="24"/>
         </w:rPr>
       </w:r>
+      <w:r/>
     </w:p>
     <w:p>
       <w:pPr>
@@ -2229,7 +2258,7 @@
                       <pic:spPr bwMode="auto">
                         <a:xfrm>
                           <a:off x="0" y="0"/>
-                          <a:ext cx="3314700" cy="3038474"/>
+                          <a:ext cx="3314700" cy="3038473"/>
                         </a:xfrm>
                         <a:prstGeom prst="rect">
                           <a:avLst/>
@@ -2273,15 +2302,21 @@
       <w:r>
         <w:rPr>
           <w:rFonts w:ascii="Times New Roman" w:hAnsi="Times New Roman" w:eastAsia="Times New Roman" w:cs="Times New Roman"/>
-          <w:color w:val="000000"/>
           <w:sz w:val="24"/>
-          <w:highlight w:val="none"/>
+          <w:szCs w:val="24"/>
+        </w:rPr>
+      </w:r>
+      <w:r>
+        <w:rPr>
+          <w:rFonts w:ascii="Times New Roman" w:hAnsi="Times New Roman" w:eastAsia="Times New Roman" w:cs="Times New Roman"/>
+          <w:sz w:val="24"/>
+          <w:szCs w:val="24"/>
         </w:rPr>
       </w:r>
     </w:p>
     <w:p>
       <w:pPr>
-        <w:pStyle w:val="905"/>
+        <w:pStyle w:val="967"/>
         <w:pBdr/>
         <w:spacing/>
         <w:ind/>
@@ -2312,7 +2347,6 @@
       <w:r>
         <w:t xml:space="preserve">1</w:t>
       </w:r>
-      <w:r/>
       <w:r>
         <w:fldChar w:fldCharType="end"/>
       </w:r>
@@ -2323,7 +2357,7 @@
     </w:p>
     <w:p>
       <w:pPr>
-        <w:pStyle w:val="868"/>
+        <w:pStyle w:val="930"/>
         <w:pBdr/>
         <w:spacing/>
         <w:ind/>
@@ -2334,7 +2368,16 @@
       <w:r>
         <w:t xml:space="preserve">2.2 Karakteristik Dataset dan Sebaran Kelas</w:t>
       </w:r>
-      <w:r/>
+      <w:r>
+        <w:rPr>
+          <w14:ligatures w14:val="none"/>
+        </w:rPr>
+      </w:r>
+      <w:r>
+        <w:rPr>
+          <w14:ligatures w14:val="none"/>
+        </w:rPr>
+      </w:r>
     </w:p>
     <w:p>
       <w:pPr>
@@ -2368,7 +2411,7 @@
     </w:p>
     <w:p>
       <w:pPr>
-        <w:pStyle w:val="905"/>
+        <w:pStyle w:val="967"/>
         <w:pBdr/>
         <w:spacing/>
         <w:ind/>
@@ -2379,11 +2422,20 @@
       <w:r>
         <w:t xml:space="preserve">Tabel 1.1 Distribusi Sampel dan Karakteristik Visual Fenotipik 7 Kelas Dataset SapiKenal</w:t>
       </w:r>
-      <w:r/>
+      <w:r>
+        <w:rPr>
+          <w14:ligatures w14:val="none"/>
+        </w:rPr>
+      </w:r>
+      <w:r>
+        <w:rPr>
+          <w14:ligatures w14:val="none"/>
+        </w:rPr>
+      </w:r>
     </w:p>
     <w:tbl>
       <w:tblPr>
-        <w:tblStyle w:val="741"/>
+        <w:tblStyle w:val="803"/>
         <w:tblW w:w="0" w:type="auto"/>
         <w:tblBorders/>
         <w:tblLayout w:type="autofit"/>
@@ -4216,7 +4268,7 @@
     </w:p>
     <w:p>
       <w:pPr>
-        <w:pStyle w:val="868"/>
+        <w:pStyle w:val="930"/>
         <w:pBdr/>
         <w:spacing/>
         <w:ind/>
@@ -4227,7 +4279,16 @@
       <w:r>
         <w:t xml:space="preserve">2.3 Formulasi Mitigasi Ketimpangan Data: Balanced Class Weighting</w:t>
       </w:r>
-      <w:r/>
+      <w:r>
+        <w:rPr>
+          <w14:ligatures w14:val="none"/>
+        </w:rPr>
+      </w:r>
+      <w:r>
+        <w:rPr>
+          <w14:ligatures w14:val="none"/>
+        </w:rPr>
+      </w:r>
     </w:p>
     <w:p>
       <w:pPr>
@@ -4299,13 +4360,13 @@
         </w:rPr>
         <w:t xml:space="preserve">. Bobot untuk masing-masing kelas  diformulasikan sebagai invers frekuensi:</w:t>
       </w:r>
-      <w:r/>
       <w:r>
         <w:rPr>
           <w:rFonts w:ascii="Times New Roman" w:hAnsi="Times New Roman" w:eastAsia="Times New Roman" w:cs="Times New Roman"/>
           <w:sz w:val="24"/>
         </w:rPr>
       </w:r>
+      <w:r/>
     </w:p>
     <w:p>
       <w:pPr>
@@ -4323,6 +4384,7 @@
           <w:szCs w:val="24"/>
         </w:rPr>
       </w:pPr>
+      <w:r/>
       <m:oMathPara>
         <m:oMathParaPr/>
         <m:oMath>
@@ -4412,8 +4474,20 @@
           </m:f>
         </m:oMath>
       </m:oMathPara>
-      <w:r/>
-      <w:r/>
+      <w:r>
+        <w:rPr>
+          <w:rFonts w:ascii="Times New Roman" w:hAnsi="Times New Roman" w:eastAsia="Times New Roman" w:cs="Times New Roman"/>
+          <w:sz w:val="24"/>
+          <w:szCs w:val="24"/>
+        </w:rPr>
+      </w:r>
+      <w:r>
+        <w:rPr>
+          <w:rFonts w:ascii="Times New Roman" w:hAnsi="Times New Roman" w:eastAsia="Times New Roman" w:cs="Times New Roman"/>
+          <w:sz w:val="24"/>
+          <w:szCs w:val="24"/>
+        </w:rPr>
+      </w:r>
     </w:p>
     <w:p>
       <w:pPr>
@@ -4545,7 +4619,7 @@
     </w:p>
     <w:p>
       <w:pPr>
-        <w:pStyle w:val="930"/>
+        <w:pStyle w:val="992"/>
         <w:numPr>
           <w:ilvl w:val="0"/>
           <w:numId w:val="33"/>
@@ -4647,10 +4721,11 @@
           <w:sz w:val="24"/>
         </w:rPr>
       </w:r>
+      <w:r/>
     </w:p>
     <w:p>
       <w:pPr>
-        <w:pStyle w:val="930"/>
+        <w:pStyle w:val="992"/>
         <w:numPr>
           <w:ilvl w:val="0"/>
           <w:numId w:val="33"/>
@@ -4746,17 +4821,8 @@
       <w:r>
         <w:rPr>
           <w:rFonts w:ascii="Times New Roman" w:hAnsi="Times New Roman" w:eastAsia="Times New Roman" w:cs="Times New Roman"/>
-          <w:color w:val="000000"/>
           <w:sz w:val="24"/>
-          <w:highlight w:val="none"/>
-        </w:rPr>
-      </w:r>
-      <w:r>
-        <w:rPr>
-          <w:rFonts w:ascii="Times New Roman" w:hAnsi="Times New Roman" w:eastAsia="Times New Roman" w:cs="Times New Roman"/>
-          <w:color w:val="000000"/>
-          <w:sz w:val="24"/>
-          <w:highlight w:val="none"/>
+          <w:szCs w:val="24"/>
         </w:rPr>
       </w:r>
       <w:r>
@@ -4769,7 +4835,7 @@
     </w:p>
     <w:p>
       <w:pPr>
-        <w:pStyle w:val="930"/>
+        <w:pStyle w:val="992"/>
         <w:numPr>
           <w:ilvl w:val="0"/>
           <w:numId w:val="33"/>
@@ -4865,9 +4931,8 @@
       <w:r>
         <w:rPr>
           <w:rFonts w:ascii="Times New Roman" w:hAnsi="Times New Roman" w:eastAsia="Times New Roman" w:cs="Times New Roman"/>
-          <w:color w:val="000000"/>
           <w:sz w:val="24"/>
-          <w:highlight w:val="none"/>
+          <w:szCs w:val="24"/>
         </w:rPr>
       </w:r>
       <w:r>
@@ -4880,7 +4945,7 @@
     </w:p>
     <w:p>
       <w:pPr>
-        <w:pStyle w:val="930"/>
+        <w:pStyle w:val="992"/>
         <w:numPr>
           <w:ilvl w:val="0"/>
           <w:numId w:val="33"/>
@@ -4976,9 +5041,8 @@
       <w:r>
         <w:rPr>
           <w:rFonts w:ascii="Times New Roman" w:hAnsi="Times New Roman" w:eastAsia="Times New Roman" w:cs="Times New Roman"/>
-          <w:color w:val="000000"/>
           <w:sz w:val="24"/>
-          <w:highlight w:val="none"/>
+          <w:szCs w:val="24"/>
         </w:rPr>
       </w:r>
       <w:r>
@@ -4991,7 +5055,7 @@
     </w:p>
     <w:p>
       <w:pPr>
-        <w:pStyle w:val="930"/>
+        <w:pStyle w:val="992"/>
         <w:numPr>
           <w:ilvl w:val="0"/>
           <w:numId w:val="33"/>
@@ -5087,17 +5151,8 @@
       <w:r>
         <w:rPr>
           <w:rFonts w:ascii="Times New Roman" w:hAnsi="Times New Roman" w:eastAsia="Times New Roman" w:cs="Times New Roman"/>
-          <w:color w:val="000000"/>
           <w:sz w:val="24"/>
-          <w:highlight w:val="none"/>
-        </w:rPr>
-      </w:r>
-      <w:r>
-        <w:rPr>
-          <w:rFonts w:ascii="Times New Roman" w:hAnsi="Times New Roman" w:eastAsia="Times New Roman" w:cs="Times New Roman"/>
-          <w:color w:val="000000"/>
-          <w:sz w:val="24"/>
-          <w:highlight w:val="none"/>
+          <w:szCs w:val="24"/>
         </w:rPr>
       </w:r>
       <w:r>
@@ -5110,7 +5165,7 @@
     </w:p>
     <w:p>
       <w:pPr>
-        <w:pStyle w:val="930"/>
+        <w:pStyle w:val="992"/>
         <w:numPr>
           <w:ilvl w:val="0"/>
           <w:numId w:val="33"/>
@@ -5206,9 +5261,8 @@
       <w:r>
         <w:rPr>
           <w:rFonts w:ascii="Times New Roman" w:hAnsi="Times New Roman" w:eastAsia="Times New Roman" w:cs="Times New Roman"/>
-          <w:color w:val="000000"/>
           <w:sz w:val="24"/>
-          <w:highlight w:val="none"/>
+          <w:szCs w:val="24"/>
         </w:rPr>
       </w:r>
       <w:r>
@@ -5221,7 +5275,7 @@
     </w:p>
     <w:p>
       <w:pPr>
-        <w:pStyle w:val="930"/>
+        <w:pStyle w:val="992"/>
         <w:numPr>
           <w:ilvl w:val="0"/>
           <w:numId w:val="33"/>
@@ -5328,26 +5382,16 @@
           <w:rFonts w:ascii="Times New Roman" w:hAnsi="Times New Roman" w:eastAsia="Times New Roman" w:cs="Times New Roman"/>
           <w:color w:val="000000"/>
           <w:sz w:val="24"/>
-          <w:highlight w:val="none"/>
         </w:rPr>
+        <w:t xml:space="preserve">(penalti diredam secara proporsional)</w:t>
       </w:r>
       <w:r>
         <w:rPr>
           <w:rFonts w:ascii="Times New Roman" w:hAnsi="Times New Roman" w:eastAsia="Times New Roman" w:cs="Times New Roman"/>
-          <w:color w:val="000000"/>
           <w:sz w:val="24"/>
-          <w:highlight w:val="none"/>
+          <w:szCs w:val="24"/>
         </w:rPr>
       </w:r>
-      <w:r>
-        <w:rPr>
-          <w:rFonts w:ascii="Times New Roman" w:hAnsi="Times New Roman" w:eastAsia="Times New Roman" w:cs="Times New Roman"/>
-          <w:color w:val="000000"/>
-          <w:sz w:val="24"/>
-        </w:rPr>
-        <w:t xml:space="preserve">(penalti diredam secara proporsional)</w:t>
-      </w:r>
-      <w:r/>
       <w:r>
         <w:rPr>
           <w:rFonts w:ascii="Times New Roman" w:hAnsi="Times New Roman" w:eastAsia="Times New Roman" w:cs="Times New Roman"/>
@@ -5402,7 +5446,19 @@
       <w:r>
         <w:rPr>
           <w:rFonts w:ascii="Times New Roman" w:hAnsi="Times New Roman" w:eastAsia="Times New Roman" w:cs="Times New Roman"/>
+          <w:color w:val="000000"/>
           <w:sz w:val="24"/>
+          <w:szCs w:val="24"/>
+          <w:highlight w:val="none"/>
+        </w:rPr>
+      </w:r>
+      <w:r>
+        <w:rPr>
+          <w:rFonts w:ascii="Times New Roman" w:hAnsi="Times New Roman" w:eastAsia="Times New Roman" w:cs="Times New Roman"/>
+          <w:color w:val="000000"/>
+          <w:sz w:val="24"/>
+          <w:szCs w:val="24"/>
+          <w:highlight w:val="none"/>
         </w:rPr>
       </w:r>
     </w:p>
@@ -5692,25 +5748,15 @@
       <w:r>
         <w:rPr>
           <w:rFonts w:ascii="Times New Roman" w:hAnsi="Times New Roman" w:eastAsia="Times New Roman" w:cs="Times New Roman"/>
-          <w:color w:val="000000"/>
           <w:sz w:val="24"/>
-          <w:highlight w:val="none"/>
+          <w:szCs w:val="24"/>
         </w:rPr>
       </w:r>
       <w:r>
         <w:rPr>
           <w:rFonts w:ascii="Times New Roman" w:hAnsi="Times New Roman" w:eastAsia="Times New Roman" w:cs="Times New Roman"/>
-          <w:color w:val="000000"/>
           <w:sz w:val="24"/>
-          <w:highlight w:val="none"/>
-        </w:rPr>
-      </w:r>
-      <w:r>
-        <w:rPr>
-          <w:rFonts w:ascii="Times New Roman" w:hAnsi="Times New Roman" w:eastAsia="Times New Roman" w:cs="Times New Roman"/>
-          <w:color w:val="000000"/>
-          <w:sz w:val="24"/>
-          <w:highlight w:val="none"/>
+          <w:szCs w:val="24"/>
         </w:rPr>
       </w:r>
     </w:p>
@@ -5889,14 +5935,26 @@
       <w:r>
         <w:rPr>
           <w:rFonts w:ascii="Times New Roman" w:hAnsi="Times New Roman" w:eastAsia="Times New Roman" w:cs="Times New Roman"/>
+          <w:color w:val="000000"/>
           <w:sz w:val="24"/>
+          <w:szCs w:val="24"/>
+          <w:highlight w:val="none"/>
+        </w:rPr>
+      </w:r>
+      <w:r>
+        <w:rPr>
+          <w:rFonts w:ascii="Times New Roman" w:hAnsi="Times New Roman" w:eastAsia="Times New Roman" w:cs="Times New Roman"/>
+          <w:color w:val="000000"/>
+          <w:sz w:val="24"/>
+          <w:szCs w:val="24"/>
+          <w:highlight w:val="none"/>
         </w:rPr>
       </w:r>
     </w:p>
     <w:p>
       <w:pPr>
         <w:pBdr/>
-        <w:shd w:val="nil"/>
+        <w:shd w:val="nil" w:color="auto"/>
         <w:spacing/>
         <w:ind/>
         <w:rPr>
@@ -5930,7 +5988,7 @@
     </w:p>
     <w:p>
       <w:pPr>
-        <w:pStyle w:val="867"/>
+        <w:pStyle w:val="929"/>
         <w:pBdr/>
         <w:spacing/>
         <w:ind/>
@@ -5941,22 +5999,40 @@
       <w:r>
         <w:t xml:space="preserve">HASIL DAN PEMBAHASAN</w:t>
       </w:r>
-      <w:r/>
-    </w:p>
-    <w:p>
-      <w:pPr>
-        <w:pStyle w:val="868"/>
-        <w:pBdr/>
-        <w:spacing/>
-        <w:ind/>
+      <w:r>
         <w:rPr>
           <w14:ligatures w14:val="none"/>
         </w:rPr>
+      </w:r>
+      <w:r>
+        <w:rPr>
+          <w14:ligatures w14:val="none"/>
+        </w:rPr>
+      </w:r>
+    </w:p>
+    <w:p>
+      <w:pPr>
+        <w:pStyle w:val="930"/>
+        <w:pBdr/>
+        <w:spacing/>
+        <w:ind/>
+        <w:rPr>
+          <w14:ligatures w14:val="none"/>
+        </w:rPr>
       </w:pPr>
       <w:r>
         <w:t xml:space="preserve">3.1 Performa Komparatif 8 Arsitektur Model</w:t>
       </w:r>
-      <w:r/>
+      <w:r>
+        <w:rPr>
+          <w14:ligatures w14:val="none"/>
+        </w:rPr>
+      </w:r>
+      <w:r>
+        <w:rPr>
+          <w14:ligatures w14:val="none"/>
+        </w:rPr>
+      </w:r>
     </w:p>
     <w:p>
       <w:pPr>
@@ -6051,7 +6127,7 @@
     </w:p>
     <w:p>
       <w:pPr>
-        <w:pStyle w:val="905"/>
+        <w:pStyle w:val="967"/>
         <w:pBdr/>
         <w:spacing/>
         <w:ind/>
@@ -6062,11 +6138,20 @@
       <w:r>
         <w:t xml:space="preserve">Tabel 1.2 Master Komparasi Performa Klasifikasi dan Profiling Deployment Komputasi Tepi (8 Arsitektur, 7 Kelas)</w:t>
       </w:r>
-      <w:r/>
+      <w:r>
+        <w:rPr>
+          <w14:ligatures w14:val="none"/>
+        </w:rPr>
+      </w:r>
+      <w:r>
+        <w:rPr>
+          <w14:ligatures w14:val="none"/>
+        </w:rPr>
+      </w:r>
     </w:p>
     <w:tbl>
       <w:tblPr>
-        <w:tblStyle w:val="741"/>
+        <w:tblStyle w:val="803"/>
         <w:tblW w:w="0" w:type="auto"/>
         <w:tblBorders/>
         <w:tblLayout w:type="fixed"/>
@@ -8676,7 +8761,7 @@
     </w:p>
     <w:p>
       <w:pPr>
-        <w:pStyle w:val="930"/>
+        <w:pStyle w:val="992"/>
         <w:numPr>
           <w:ilvl w:val="0"/>
           <w:numId w:val="46"/>
@@ -8798,7 +8883,7 @@
     </w:p>
     <w:p>
       <w:pPr>
-        <w:pStyle w:val="930"/>
+        <w:pStyle w:val="992"/>
         <w:numPr>
           <w:ilvl w:val="0"/>
           <w:numId w:val="46"/>
@@ -8903,7 +8988,7 @@
     </w:p>
     <w:p>
       <w:pPr>
-        <w:pStyle w:val="930"/>
+        <w:pStyle w:val="992"/>
         <w:numPr>
           <w:ilvl w:val="0"/>
           <w:numId w:val="46"/>
@@ -8965,7 +9050,7 @@
     </w:p>
     <w:p>
       <w:pPr>
-        <w:pStyle w:val="930"/>
+        <w:pStyle w:val="992"/>
         <w:numPr>
           <w:ilvl w:val="0"/>
           <w:numId w:val="46"/>
@@ -9027,7 +9112,7 @@
     </w:p>
     <w:p>
       <w:pPr>
-        <w:pStyle w:val="868"/>
+        <w:pStyle w:val="930"/>
         <w:pBdr/>
         <w:spacing/>
         <w:ind/>
@@ -9038,7 +9123,16 @@
       <w:r>
         <w:t xml:space="preserve">3.2 Analisis Kurva Pareto Trade-off Deployment Komputasi Tepi</w:t>
       </w:r>
-      <w:r/>
+      <w:r>
+        <w:rPr>
+          <w14:ligatures w14:val="none"/>
+        </w:rPr>
+      </w:r>
+      <w:r>
+        <w:rPr>
+          <w14:ligatures w14:val="none"/>
+        </w:rPr>
+      </w:r>
     </w:p>
     <w:p>
       <w:pPr>
@@ -9198,7 +9292,7 @@
     </w:p>
     <w:p>
       <w:pPr>
-        <w:pStyle w:val="905"/>
+        <w:pStyle w:val="967"/>
         <w:pBdr/>
         <w:spacing/>
         <w:ind/>
@@ -9209,7 +9303,16 @@
       <w:r>
         <w:t xml:space="preserve">Gambar 1.2 Analisis Pareto Trade-off antara Macro F1-Score, Latensi Inferensi CPU Android, dan Ukuran Berkas TFLite untuk 8 arsitektur model pada Benchmark 2.1.</w:t>
       </w:r>
-      <w:r/>
+      <w:r>
+        <w:rPr>
+          <w14:ligatures w14:val="none"/>
+        </w:rPr>
+      </w:r>
+      <w:r>
+        <w:rPr>
+          <w14:ligatures w14:val="none"/>
+        </w:rPr>
+      </w:r>
     </w:p>
     <w:p>
       <w:pPr>
@@ -9235,7 +9338,7 @@
     </w:p>
     <w:p>
       <w:pPr>
-        <w:pStyle w:val="930"/>
+        <w:pStyle w:val="992"/>
         <w:numPr>
           <w:ilvl w:val="0"/>
           <w:numId w:val="47"/>
@@ -9339,7 +9442,7 @@
     </w:p>
     <w:p>
       <w:pPr>
-        <w:pStyle w:val="930"/>
+        <w:pStyle w:val="992"/>
         <w:numPr>
           <w:ilvl w:val="0"/>
           <w:numId w:val="47"/>
@@ -9392,7 +9495,7 @@
     </w:p>
     <w:p>
       <w:pPr>
-        <w:pStyle w:val="930"/>
+        <w:pStyle w:val="992"/>
         <w:numPr>
           <w:ilvl w:val="0"/>
           <w:numId w:val="47"/>
@@ -9479,7 +9582,7 @@
     </w:p>
     <w:p>
       <w:pPr>
-        <w:pStyle w:val="868"/>
+        <w:pStyle w:val="930"/>
         <w:pBdr/>
         <w:spacing/>
         <w:ind/>
@@ -9490,7 +9593,16 @@
       <w:r>
         <w:t xml:space="preserve">3.3 Evaluasi Metrik Per-Kelas dan Ketahanan Deteksi Ras Minoritas</w:t>
       </w:r>
-      <w:r/>
+      <w:r>
+        <w:rPr>
+          <w14:ligatures w14:val="none"/>
+        </w:rPr>
+      </w:r>
+      <w:r>
+        <w:rPr>
+          <w14:ligatures w14:val="none"/>
+        </w:rPr>
+      </w:r>
     </w:p>
     <w:p>
       <w:pPr>
@@ -9516,7 +9628,7 @@
     </w:p>
     <w:p>
       <w:pPr>
-        <w:pStyle w:val="905"/>
+        <w:pStyle w:val="967"/>
         <w:pBdr/>
         <w:spacing/>
         <w:ind/>
@@ -9527,11 +9639,20 @@
       <w:r>
         <w:t xml:space="preserve">Tabel 1.3 Rincian Metrik Per-Kelas Ras Sapi pada Fase 2 (Mean 5-Fold CV)</w:t>
       </w:r>
-      <w:r/>
+      <w:r>
+        <w:rPr>
+          <w14:ligatures w14:val="none"/>
+        </w:rPr>
+      </w:r>
+      <w:r>
+        <w:rPr>
+          <w14:ligatures w14:val="none"/>
+        </w:rPr>
+      </w:r>
     </w:p>
     <w:tbl>
       <w:tblPr>
-        <w:tblStyle w:val="741"/>
+        <w:tblStyle w:val="803"/>
         <w:tblW w:w="0" w:type="auto"/>
         <w:tblBorders/>
         <w:tblLayout w:type="autofit"/>
@@ -9946,10 +10067,11 @@
           <w:p>
             <w:pPr>
               <w:pBdr/>
-              <w:spacing w:after="0" w:before="0" w:line="240"/>
+              <w:spacing w:after="0" w:before="0" w:line="240" w:lineRule="auto"/>
               <w:ind/>
               <w:rPr/>
             </w:pPr>
+            <w:r/>
             <w:r/>
           </w:p>
         </w:tc>
@@ -10114,10 +10236,11 @@
           <w:p>
             <w:pPr>
               <w:pBdr/>
-              <w:spacing w:after="0" w:before="0" w:line="240"/>
+              <w:spacing w:after="0" w:before="0" w:line="240" w:lineRule="auto"/>
               <w:ind/>
               <w:rPr/>
             </w:pPr>
+            <w:r/>
             <w:r/>
           </w:p>
         </w:tc>
@@ -10282,10 +10405,11 @@
           <w:p>
             <w:pPr>
               <w:pBdr/>
-              <w:spacing w:after="0" w:before="0" w:line="240"/>
+              <w:spacing w:after="0" w:before="0" w:line="240" w:lineRule="auto"/>
               <w:ind/>
               <w:rPr/>
             </w:pPr>
+            <w:r/>
             <w:r/>
           </w:p>
         </w:tc>
@@ -10450,10 +10574,11 @@
           <w:p>
             <w:pPr>
               <w:pBdr/>
-              <w:spacing w:after="0" w:before="0" w:line="240"/>
+              <w:spacing w:after="0" w:before="0" w:line="240" w:lineRule="auto"/>
               <w:ind/>
               <w:rPr/>
             </w:pPr>
+            <w:r/>
             <w:r/>
           </w:p>
         </w:tc>
@@ -10637,10 +10762,11 @@
           <w:p>
             <w:pPr>
               <w:pBdr/>
-              <w:spacing w:after="0" w:before="0" w:line="240"/>
+              <w:spacing w:after="0" w:before="0" w:line="240" w:lineRule="auto"/>
               <w:ind/>
               <w:rPr/>
             </w:pPr>
+            <w:r/>
             <w:r/>
           </w:p>
         </w:tc>
@@ -10790,7 +10916,6 @@
               </w:rPr>
               <w:t xml:space="preserve">Ras Lokal Jawa Barat (</w:t>
             </w:r>
-            <w:r/>
             <m:oMath>
               <m:r>
                 <w:rPr>
@@ -10823,10 +10948,11 @@
           <w:p>
             <w:pPr>
               <w:pBdr/>
-              <w:spacing w:after="0" w:before="0" w:line="240"/>
+              <w:spacing w:after="0" w:before="0" w:line="240" w:lineRule="auto"/>
               <w:ind/>
               <w:rPr/>
             </w:pPr>
+            <w:r/>
             <w:r/>
           </w:p>
         </w:tc>
@@ -11173,10 +11299,11 @@
           <w:p>
             <w:pPr>
               <w:pBdr/>
-              <w:spacing w:after="0" w:before="0" w:line="240"/>
+              <w:spacing w:after="0" w:before="0" w:line="240" w:lineRule="auto"/>
               <w:ind/>
               <w:rPr/>
             </w:pPr>
+            <w:r/>
             <w:r/>
           </w:p>
         </w:tc>
@@ -11340,10 +11467,11 @@
           <w:p>
             <w:pPr>
               <w:pBdr/>
-              <w:spacing w:after="0" w:before="0" w:line="240"/>
+              <w:spacing w:after="0" w:before="0" w:line="240" w:lineRule="auto"/>
               <w:ind/>
               <w:rPr/>
             </w:pPr>
+            <w:r/>
             <w:r/>
           </w:p>
         </w:tc>
@@ -11507,10 +11635,11 @@
           <w:p>
             <w:pPr>
               <w:pBdr/>
-              <w:spacing w:after="0" w:before="0" w:line="240"/>
+              <w:spacing w:after="0" w:before="0" w:line="240" w:lineRule="auto"/>
               <w:ind/>
               <w:rPr/>
             </w:pPr>
+            <w:r/>
             <w:r/>
           </w:p>
         </w:tc>
@@ -11674,10 +11803,11 @@
           <w:p>
             <w:pPr>
               <w:pBdr/>
-              <w:spacing w:after="0" w:before="0" w:line="240"/>
+              <w:spacing w:after="0" w:before="0" w:line="240" w:lineRule="auto"/>
               <w:ind/>
               <w:rPr/>
             </w:pPr>
+            <w:r/>
             <w:r/>
           </w:p>
         </w:tc>
@@ -11841,10 +11971,11 @@
           <w:p>
             <w:pPr>
               <w:pBdr/>
-              <w:spacing w:after="0" w:before="0" w:line="240"/>
+              <w:spacing w:after="0" w:before="0" w:line="240" w:lineRule="auto"/>
               <w:ind/>
               <w:rPr/>
             </w:pPr>
+            <w:r/>
             <w:r/>
           </w:p>
         </w:tc>
@@ -12008,10 +12139,11 @@
           <w:p>
             <w:pPr>
               <w:pBdr/>
-              <w:spacing w:after="0" w:before="0" w:line="240"/>
+              <w:spacing w:after="0" w:before="0" w:line="240" w:lineRule="auto"/>
               <w:ind/>
               <w:rPr/>
             </w:pPr>
+            <w:r/>
             <w:r/>
           </w:p>
         </w:tc>
@@ -12356,10 +12488,11 @@
           <w:p>
             <w:pPr>
               <w:pBdr/>
-              <w:spacing w:after="0" w:before="0" w:line="240"/>
+              <w:spacing w:after="0" w:before="0" w:line="240" w:lineRule="auto"/>
               <w:ind/>
               <w:rPr/>
             </w:pPr>
+            <w:r/>
             <w:r/>
           </w:p>
         </w:tc>
@@ -12523,10 +12656,11 @@
           <w:p>
             <w:pPr>
               <w:pBdr/>
-              <w:spacing w:after="0" w:before="0" w:line="240"/>
+              <w:spacing w:after="0" w:before="0" w:line="240" w:lineRule="auto"/>
               <w:ind/>
               <w:rPr/>
             </w:pPr>
+            <w:r/>
             <w:r/>
           </w:p>
         </w:tc>
@@ -12690,10 +12824,11 @@
           <w:p>
             <w:pPr>
               <w:pBdr/>
-              <w:spacing w:after="0" w:before="0" w:line="240"/>
+              <w:spacing w:after="0" w:before="0" w:line="240" w:lineRule="auto"/>
               <w:ind/>
               <w:rPr/>
             </w:pPr>
+            <w:r/>
             <w:r/>
           </w:p>
         </w:tc>
@@ -12857,10 +12992,11 @@
           <w:p>
             <w:pPr>
               <w:pBdr/>
-              <w:spacing w:after="0" w:before="0" w:line="240"/>
+              <w:spacing w:after="0" w:before="0" w:line="240" w:lineRule="auto"/>
               <w:ind/>
               <w:rPr/>
             </w:pPr>
+            <w:r/>
             <w:r/>
           </w:p>
         </w:tc>
@@ -13024,10 +13160,11 @@
           <w:p>
             <w:pPr>
               <w:pBdr/>
-              <w:spacing w:after="0" w:before="0" w:line="240"/>
+              <w:spacing w:after="0" w:before="0" w:line="240" w:lineRule="auto"/>
               <w:ind/>
               <w:rPr/>
             </w:pPr>
+            <w:r/>
             <w:r/>
           </w:p>
         </w:tc>
@@ -13191,10 +13328,11 @@
           <w:p>
             <w:pPr>
               <w:pBdr/>
-              <w:spacing w:after="0" w:before="0" w:line="240"/>
+              <w:spacing w:after="0" w:before="0" w:line="240" w:lineRule="auto"/>
               <w:ind/>
               <w:rPr/>
             </w:pPr>
+            <w:r/>
             <w:r/>
           </w:p>
         </w:tc>
@@ -13562,10 +13700,11 @@
           <w:p>
             <w:pPr>
               <w:pBdr/>
-              <w:spacing w:after="0" w:before="0" w:line="240"/>
+              <w:spacing w:after="0" w:before="0" w:line="240" w:lineRule="auto"/>
               <w:ind/>
               <w:rPr/>
             </w:pPr>
+            <w:r/>
             <w:r/>
           </w:p>
         </w:tc>
@@ -13729,10 +13868,11 @@
           <w:p>
             <w:pPr>
               <w:pBdr/>
-              <w:spacing w:after="0" w:before="0" w:line="240"/>
+              <w:spacing w:after="0" w:before="0" w:line="240" w:lineRule="auto"/>
               <w:ind/>
               <w:rPr/>
             </w:pPr>
+            <w:r/>
             <w:r/>
           </w:p>
         </w:tc>
@@ -13896,10 +14036,11 @@
           <w:p>
             <w:pPr>
               <w:pBdr/>
-              <w:spacing w:after="0" w:before="0" w:line="240"/>
+              <w:spacing w:after="0" w:before="0" w:line="240" w:lineRule="auto"/>
               <w:ind/>
               <w:rPr/>
             </w:pPr>
+            <w:r/>
             <w:r/>
           </w:p>
         </w:tc>
@@ -14063,10 +14204,11 @@
           <w:p>
             <w:pPr>
               <w:pBdr/>
-              <w:spacing w:after="0" w:before="0" w:line="240"/>
+              <w:spacing w:after="0" w:before="0" w:line="240" w:lineRule="auto"/>
               <w:ind/>
               <w:rPr/>
             </w:pPr>
+            <w:r/>
             <w:r/>
           </w:p>
         </w:tc>
@@ -14230,10 +14372,11 @@
           <w:p>
             <w:pPr>
               <w:pBdr/>
-              <w:spacing w:after="0" w:before="0" w:line="240"/>
+              <w:spacing w:after="0" w:before="0" w:line="240" w:lineRule="auto"/>
               <w:ind/>
               <w:rPr/>
             </w:pPr>
+            <w:r/>
             <w:r/>
           </w:p>
         </w:tc>
@@ -14397,10 +14540,11 @@
           <w:p>
             <w:pPr>
               <w:pBdr/>
-              <w:spacing w:after="0" w:before="0" w:line="240"/>
+              <w:spacing w:after="0" w:before="0" w:line="240" w:lineRule="auto"/>
               <w:ind/>
               <w:rPr/>
             </w:pPr>
+            <w:r/>
             <w:r/>
           </w:p>
         </w:tc>
@@ -14745,10 +14889,11 @@
           <w:p>
             <w:pPr>
               <w:pBdr/>
-              <w:spacing w:after="0" w:before="0" w:line="240"/>
+              <w:spacing w:after="0" w:before="0" w:line="240" w:lineRule="auto"/>
               <w:ind/>
               <w:rPr/>
             </w:pPr>
+            <w:r/>
             <w:r/>
           </w:p>
         </w:tc>
@@ -14912,10 +15057,11 @@
           <w:p>
             <w:pPr>
               <w:pBdr/>
-              <w:spacing w:after="0" w:before="0" w:line="240"/>
+              <w:spacing w:after="0" w:before="0" w:line="240" w:lineRule="auto"/>
               <w:ind/>
               <w:rPr/>
             </w:pPr>
+            <w:r/>
             <w:r/>
           </w:p>
         </w:tc>
@@ -15079,10 +15225,11 @@
           <w:p>
             <w:pPr>
               <w:pBdr/>
-              <w:spacing w:after="0" w:before="0" w:line="240"/>
+              <w:spacing w:after="0" w:before="0" w:line="240" w:lineRule="auto"/>
               <w:ind/>
               <w:rPr/>
             </w:pPr>
+            <w:r/>
             <w:r/>
           </w:p>
         </w:tc>
@@ -15246,10 +15393,11 @@
           <w:p>
             <w:pPr>
               <w:pBdr/>
-              <w:spacing w:after="0" w:before="0" w:line="240"/>
+              <w:spacing w:after="0" w:before="0" w:line="240" w:lineRule="auto"/>
               <w:ind/>
               <w:rPr/>
             </w:pPr>
+            <w:r/>
             <w:r/>
           </w:p>
         </w:tc>
@@ -15413,10 +15561,11 @@
           <w:p>
             <w:pPr>
               <w:pBdr/>
-              <w:spacing w:after="0" w:before="0" w:line="240"/>
+              <w:spacing w:after="0" w:before="0" w:line="240" w:lineRule="auto"/>
               <w:ind/>
               <w:rPr/>
             </w:pPr>
+            <w:r/>
             <w:r/>
           </w:p>
         </w:tc>
@@ -15580,10 +15729,11 @@
           <w:p>
             <w:pPr>
               <w:pBdr/>
-              <w:spacing w:after="0" w:before="0" w:line="240"/>
+              <w:spacing w:after="0" w:before="0" w:line="240" w:lineRule="auto"/>
               <w:ind/>
               <w:rPr/>
             </w:pPr>
+            <w:r/>
             <w:r/>
           </w:p>
         </w:tc>
@@ -15761,7 +15911,7 @@
     </w:p>
     <w:p>
       <w:pPr>
-        <w:pStyle w:val="930"/>
+        <w:pStyle w:val="992"/>
         <w:numPr>
           <w:ilvl w:val="0"/>
           <w:numId w:val="48"/>
@@ -15866,7 +16016,7 @@
     </w:p>
     <w:p>
       <w:pPr>
-        <w:pStyle w:val="930"/>
+        <w:pStyle w:val="992"/>
         <w:numPr>
           <w:ilvl w:val="0"/>
           <w:numId w:val="48"/>
@@ -15949,7 +16099,6 @@
         </w:rPr>
         <w:t xml:space="preserve">, arsitektur berkapasitas besar ConvNeXtTiny mengalami degenerasi bobot pada sampel berukuran </w:t>
       </w:r>
-      <w:r/>
       <m:oMath>
         <m:r>
           <w:rPr>
@@ -15959,7 +16108,6 @@
           <m:t>N=9</m:t>
         </m:r>
       </m:oMath>
-      <w:r/>
       <w:r>
         <w:rPr>
           <w:rFonts w:ascii="Times New Roman" w:hAnsi="Times New Roman" w:eastAsia="Times New Roman" w:cs="Times New Roman"/>
@@ -15972,7 +16120,7 @@
     </w:p>
     <w:p>
       <w:pPr>
-        <w:pStyle w:val="930"/>
+        <w:pStyle w:val="992"/>
         <w:numPr>
           <w:ilvl w:val="0"/>
           <w:numId w:val="48"/>
@@ -16076,7 +16224,7 @@
     </w:p>
     <w:p>
       <w:pPr>
-        <w:pStyle w:val="930"/>
+        <w:pStyle w:val="992"/>
         <w:numPr>
           <w:ilvl w:val="0"/>
           <w:numId w:val="48"/>
@@ -16129,7 +16277,7 @@
     </w:p>
     <w:p>
       <w:pPr>
-        <w:pStyle w:val="868"/>
+        <w:pStyle w:val="930"/>
         <w:pBdr/>
         <w:spacing/>
         <w:ind/>
@@ -16140,7 +16288,16 @@
       <w:r>
         <w:t xml:space="preserve">3.4 Analisis Visual Matriks Konfusi Agregat 7-Kelas</w:t>
       </w:r>
-      <w:r/>
+      <w:r>
+        <w:rPr>
+          <w14:ligatures w14:val="none"/>
+        </w:rPr>
+      </w:r>
+      <w:r>
+        <w:rPr>
+          <w14:ligatures w14:val="none"/>
+        </w:rPr>
+      </w:r>
     </w:p>
     <w:p>
       <w:pPr>
@@ -16249,7 +16406,7 @@
     </w:p>
     <w:p>
       <w:pPr>
-        <w:pStyle w:val="905"/>
+        <w:pStyle w:val="967"/>
         <w:pBdr/>
         <w:spacing/>
         <w:ind/>
@@ -16260,7 +16417,16 @@
       <w:r>
         <w:t xml:space="preserve">Gambar 1.3 Matriks konfusi agregat (5-Fold CV) 8 arsitektur model pada klasifikasi 7 kelas SapiKenal.</w:t>
       </w:r>
-      <w:r/>
+      <w:r>
+        <w:rPr>
+          <w14:ligatures w14:val="none"/>
+        </w:rPr>
+      </w:r>
+      <w:r>
+        <w:rPr>
+          <w14:ligatures w14:val="none"/>
+        </w:rPr>
+      </w:r>
     </w:p>
     <w:p>
       <w:pPr>
@@ -16286,7 +16452,7 @@
     </w:p>
     <w:p>
       <w:pPr>
-        <w:pStyle w:val="930"/>
+        <w:pStyle w:val="992"/>
         <w:numPr>
           <w:ilvl w:val="0"/>
           <w:numId w:val="49"/>
@@ -16370,7 +16536,7 @@
     </w:p>
     <w:p>
       <w:pPr>
-        <w:pStyle w:val="930"/>
+        <w:pStyle w:val="992"/>
         <w:numPr>
           <w:ilvl w:val="0"/>
           <w:numId w:val="49"/>
@@ -16406,7 +16572,7 @@
     </w:p>
     <w:p>
       <w:pPr>
-        <w:pStyle w:val="930"/>
+        <w:pStyle w:val="992"/>
         <w:numPr>
           <w:ilvl w:val="1"/>
           <w:numId w:val="49"/>
@@ -16442,7 +16608,7 @@
     </w:p>
     <w:p>
       <w:pPr>
-        <w:pStyle w:val="930"/>
+        <w:pStyle w:val="992"/>
         <w:numPr>
           <w:ilvl w:val="1"/>
           <w:numId w:val="49"/>
@@ -16478,7 +16644,7 @@
     </w:p>
     <w:p>
       <w:pPr>
-        <w:pStyle w:val="930"/>
+        <w:pStyle w:val="992"/>
         <w:numPr>
           <w:ilvl w:val="0"/>
           <w:numId w:val="49"/>
@@ -16530,7 +16696,7 @@
     </w:p>
     <w:p>
       <w:pPr>
-        <w:pStyle w:val="868"/>
+        <w:pStyle w:val="930"/>
         <w:pBdr/>
         <w:spacing/>
         <w:ind/>
@@ -16541,7 +16707,16 @@
       <w:r>
         <w:t xml:space="preserve">3.5 Validasi Statistik Formal: Uji McNemar 8x8 dan Pembuktian Hipotesis Inductive Bias</w:t>
       </w:r>
-      <w:r/>
+      <w:r>
+        <w:rPr>
+          <w14:ligatures w14:val="none"/>
+        </w:rPr>
+      </w:r>
+      <w:r>
+        <w:rPr>
+          <w14:ligatures w14:val="none"/>
+        </w:rPr>
+      </w:r>
     </w:p>
     <w:p>
       <w:pPr>
@@ -16618,7 +16793,7 @@
     </w:p>
     <w:p>
       <w:pPr>
-        <w:pStyle w:val="905"/>
+        <w:pStyle w:val="967"/>
         <w:pBdr/>
         <w:spacing/>
         <w:ind/>
@@ -16629,11 +16804,20 @@
       <w:r>
         <w:t xml:space="preserve">Tabel 1.4 Matriks Uji Signifikansi Statistik Pairwise McNemar (8x8 Pasangan Model)</w:t>
       </w:r>
-      <w:r/>
+      <w:r>
+        <w:rPr>
+          <w14:ligatures w14:val="none"/>
+        </w:rPr>
+      </w:r>
+      <w:r>
+        <w:rPr>
+          <w14:ligatures w14:val="none"/>
+        </w:rPr>
+      </w:r>
     </w:p>
     <w:tbl>
       <w:tblPr>
-        <w:tblStyle w:val="741"/>
+        <w:tblStyle w:val="803"/>
         <w:tblW w:w="0" w:type="auto"/>
         <w:tblBorders/>
         <w:tblLayout w:type="autofit"/>
@@ -17362,7 +17546,6 @@
                 <m:t>p&lt;0.05</m:t>
               </m:r>
             </m:oMath>
-            <w:r/>
             <w:r>
               <w:rPr>
                 <w:rFonts w:ascii="Times New Roman" w:hAnsi="Times New Roman" w:eastAsia="Times New Roman" w:cs="Times New Roman"/>
@@ -19818,7 +20001,6 @@
         </w:rPr>
         <w:t xml:space="preserve">Catatan: </w:t>
       </w:r>
-      <w:r/>
       <m:oMath>
         <m:r>
           <w:rPr>
@@ -19828,7 +20010,6 @@
           <m:t>b</m:t>
         </m:r>
       </m:oMath>
-      <w:r/>
       <w:r>
         <w:rPr>
           <w:rFonts w:ascii="Times New Roman" w:hAnsi="Times New Roman" w:eastAsia="Times New Roman" w:cs="Times New Roman"/>
@@ -19838,7 +20019,6 @@
         </w:rPr>
         <w:t xml:space="preserve"> menyatakan jumlah sampel di mana Model A benar dan Model B salah;  </w:t>
       </w:r>
-      <w:r/>
       <m:oMath>
         <m:r>
           <w:rPr>
@@ -19848,7 +20028,6 @@
           <m:t>c</m:t>
         </m:r>
       </m:oMath>
-      <w:r/>
       <w:r>
         <w:rPr>
           <w:rFonts w:ascii="Times New Roman" w:hAnsi="Times New Roman" w:eastAsia="Times New Roman" w:cs="Times New Roman"/>
@@ -19884,7 +20063,7 @@
     </w:p>
     <w:p>
       <w:pPr>
-        <w:pStyle w:val="930"/>
+        <w:pStyle w:val="992"/>
         <w:numPr>
           <w:ilvl w:val="0"/>
           <w:numId w:val="50"/>
@@ -20073,7 +20252,7 @@
     </w:p>
     <w:p>
       <w:pPr>
-        <w:pStyle w:val="930"/>
+        <w:pStyle w:val="992"/>
         <w:numPr>
           <w:ilvl w:val="0"/>
           <w:numId w:val="50"/>
@@ -20170,11 +20349,12 @@
           <w:sz w:val="24"/>
         </w:rPr>
       </w:r>
+      <w:r/>
     </w:p>
     <w:p>
       <w:pPr>
         <w:pBdr/>
-        <w:shd w:val="nil"/>
+        <w:shd w:val="nil" w:color="auto"/>
         <w:spacing/>
         <w:ind/>
         <w:rPr>
@@ -20208,7 +20388,7 @@
     </w:p>
     <w:p>
       <w:pPr>
-        <w:pStyle w:val="867"/>
+        <w:pStyle w:val="929"/>
         <w:pBdr/>
         <w:spacing/>
         <w:ind/>
@@ -20219,7 +20399,16 @@
       <w:r>
         <w:t xml:space="preserve">KESIMPULAN</w:t>
       </w:r>
-      <w:r/>
+      <w:r>
+        <w:rPr>
+          <w14:ligatures w14:val="none"/>
+        </w:rPr>
+      </w:r>
+      <w:r>
+        <w:rPr>
+          <w14:ligatures w14:val="none"/>
+        </w:rPr>
+      </w:r>
     </w:p>
     <w:p>
       <w:pPr>
@@ -20245,7 +20434,7 @@
     </w:p>
     <w:p>
       <w:pPr>
-        <w:pStyle w:val="930"/>
+        <w:pStyle w:val="992"/>
         <w:numPr>
           <w:ilvl w:val="0"/>
           <w:numId w:val="51"/>
@@ -20349,7 +20538,7 @@
     </w:p>
     <w:p>
       <w:pPr>
-        <w:pStyle w:val="930"/>
+        <w:pStyle w:val="992"/>
         <w:numPr>
           <w:ilvl w:val="0"/>
           <w:numId w:val="51"/>
@@ -20409,7 +20598,7 @@
     </w:p>
     <w:p>
       <w:pPr>
-        <w:pStyle w:val="930"/>
+        <w:pStyle w:val="992"/>
         <w:numPr>
           <w:ilvl w:val="0"/>
           <w:numId w:val="51"/>
@@ -20470,14 +20659,6 @@
       <w:r>
         <w:rPr>
           <w:rFonts w:ascii="Times New Roman" w:hAnsi="Times New Roman" w:eastAsia="Times New Roman" w:cs="Times New Roman"/>
-          <w:b/>
-          <w:color w:val="000000"/>
-          <w:sz w:val="24"/>
-        </w:rPr>
-      </w:r>
-      <w:r>
-        <w:rPr>
-          <w:rFonts w:ascii="Times New Roman" w:hAnsi="Times New Roman" w:eastAsia="Times New Roman" w:cs="Times New Roman"/>
           <w:color w:val="000000"/>
           <w:sz w:val="24"/>
         </w:rPr>
@@ -20504,7 +20685,7 @@
     </w:p>
     <w:p>
       <w:pPr>
-        <w:pStyle w:val="930"/>
+        <w:pStyle w:val="992"/>
         <w:numPr>
           <w:ilvl w:val="0"/>
           <w:numId w:val="51"/>
@@ -20562,111 +20743,6 @@
         <w:t xml:space="preserve"> pada Sapi Aceh, F1 = 0.0000) serta memiliki latensi CPU paling boros (242.76 ms), sehingga tidak direkomendasikan untuk implementasi lapangan.</w:t>
       </w:r>
       <w:r/>
-    </w:p>
-    <w:p>
-      <w:pPr>
-        <w:pBdr>
-          <w:top w:val="none" w:color="000000" w:sz="4" w:space="0"/>
-          <w:left w:val="none" w:color="000000" w:sz="4" w:space="0"/>
-          <w:bottom w:val="none" w:color="000000" w:sz="4" w:space="0"/>
-          <w:right w:val="none" w:color="000000" w:sz="4" w:space="0"/>
-        </w:pBdr>
-        <w:spacing/>
-        <w:ind w:right="0" w:firstLine="0" w:left="0"/>
-        <w:rPr>
-          <w:rFonts w:ascii="Times New Roman" w:hAnsi="Times New Roman" w:eastAsia="Times New Roman" w:cs="Times New Roman"/>
-          <w:color w:val="000000"/>
-          <w:sz w:val="24"/>
-          <w:szCs w:val="24"/>
-          <w:highlight w:val="none"/>
-        </w:rPr>
-      </w:pPr>
-      <w:r>
-        <w:rPr>
-          <w:rFonts w:ascii="Times New Roman" w:hAnsi="Times New Roman" w:eastAsia="Times New Roman" w:cs="Times New Roman"/>
-          <w:b/>
-          <w:color w:val="000000"/>
-          <w:sz w:val="24"/>
-        </w:rPr>
-        <w:t xml:space="preserve">Rekomendasi Tindak Lanjut: </w:t>
-      </w:r>
-      <w:r>
-        <w:rPr>
-          <w:rFonts w:ascii="Times New Roman" w:hAnsi="Times New Roman" w:eastAsia="Times New Roman" w:cs="Times New Roman"/>
-          <w:color w:val="000000"/>
-          <w:sz w:val="24"/>
-        </w:rPr>
-        <w:t xml:space="preserve">Bobot model MobileNetV3Large dari Benchmark 2.1 direkomendasikan untuk dikonversi menjadi artefak produksi </w:t>
-      </w:r>
-      <w:r>
-        <w:rPr>
-          <w:rFonts w:ascii="Courier New" w:hAnsi="Courier New" w:eastAsia="Courier New" w:cs="Courier New"/>
-          <w:color w:val="000000"/>
-          <w:sz w:val="20"/>
-        </w:rPr>
-        <w:t xml:space="preserve">lokal_fp32.tflite</w:t>
-      </w:r>
-      <w:r>
-        <w:rPr>
-          <w:rFonts w:ascii="Times New Roman" w:hAnsi="Times New Roman" w:eastAsia="Times New Roman" w:cs="Times New Roman"/>
-          <w:color w:val="000000"/>
-          <w:sz w:val="24"/>
-        </w:rPr>
-        <w:t xml:space="preserve"> pada aplikasi mobile Android SapiKenal guna mendukung pencapaian Tingkat Kesiapterapan Teknologi </w:t>
-      </w:r>
-      <w:r>
-        <w:rPr>
-          <w:rFonts w:ascii="Times New Roman" w:hAnsi="Times New Roman" w:eastAsia="Times New Roman" w:cs="Times New Roman"/>
-          <w:b/>
-          <w:color w:val="000000"/>
-          <w:sz w:val="24"/>
-        </w:rPr>
-        <w:t xml:space="preserve">TKT 5</w:t>
-      </w:r>
-      <w:r>
-        <w:rPr>
-          <w:rFonts w:ascii="Times New Roman" w:hAnsi="Times New Roman" w:eastAsia="Times New Roman" w:cs="Times New Roman"/>
-          <w:color w:val="000000"/>
-          <w:sz w:val="24"/>
-        </w:rPr>
-        <w:t xml:space="preserve">. Penelitian lanjutan disarankan mengeksplorasi teknik kuantisasi bilangan bulat 8-bit (</w:t>
-      </w:r>
-      <w:r>
-        <w:rPr>
-          <w:rFonts w:ascii="Times New Roman" w:hAnsi="Times New Roman" w:eastAsia="Times New Roman" w:cs="Times New Roman"/>
-          <w:i/>
-          <w:color w:val="000000"/>
-          <w:sz w:val="24"/>
-        </w:rPr>
-        <w:t xml:space="preserve">INT8 Post-Training Quantization</w:t>
-      </w:r>
-      <w:r>
-        <w:rPr>
-          <w:rFonts w:ascii="Times New Roman" w:hAnsi="Times New Roman" w:eastAsia="Times New Roman" w:cs="Times New Roman"/>
-          <w:color w:val="000000"/>
-          <w:sz w:val="24"/>
-        </w:rPr>
-        <w:t xml:space="preserve">) untuk memangkas ukuran berkas menjadi ~3.1 MB dengan latensi CPU &lt;4 ms.</w:t>
-      </w:r>
-      <w:r>
-        <w:rPr>
-          <w:rFonts w:ascii="Times New Roman" w:hAnsi="Times New Roman" w:eastAsia="Times New Roman" w:cs="Times New Roman"/>
-          <w:sz w:val="24"/>
-        </w:rPr>
-      </w:r>
-    </w:p>
-    <w:p>
-      <w:pPr>
-        <w:pBdr/>
-        <w:shd w:val="nil"/>
-        <w:spacing/>
-        <w:ind/>
-        <w:rPr>
-          <w:rFonts w:ascii="Times New Roman" w:hAnsi="Times New Roman" w:eastAsia="Times New Roman" w:cs="Times New Roman"/>
-          <w:sz w:val="24"/>
-          <w:szCs w:val="24"/>
-        </w:rPr>
-      </w:pPr>
       <w:r>
         <w:rPr>
           <w:rFonts w:ascii="Times New Roman" w:hAnsi="Times New Roman" w:eastAsia="Times New Roman" w:cs="Times New Roman"/>
@@ -20689,41 +20765,11 @@
           <w:szCs w:val="24"/>
         </w:rPr>
       </w:r>
-      <w:r>
-        <w:rPr>
-          <w:rFonts w:ascii="Times New Roman" w:hAnsi="Times New Roman" w:eastAsia="Times New Roman" w:cs="Times New Roman"/>
-          <w:color w:val="000000"/>
-          <w:sz w:val="24"/>
-          <w:highlight w:val="none"/>
-        </w:rPr>
-      </w:r>
-      <w:r>
-        <w:rPr>
-          <w:rFonts w:ascii="Times New Roman" w:hAnsi="Times New Roman" w:eastAsia="Times New Roman" w:cs="Times New Roman"/>
-          <w:color w:val="000000"/>
-          <w:sz w:val="24"/>
-          <w:highlight w:val="none"/>
-        </w:rPr>
-      </w:r>
-      <w:r>
-        <w:rPr>
-          <w:rFonts w:ascii="Times New Roman" w:hAnsi="Times New Roman" w:eastAsia="Times New Roman" w:cs="Times New Roman"/>
-          <w:color w:val="000000"/>
-          <w:sz w:val="24"/>
-          <w:highlight w:val="none"/>
-        </w:rPr>
-      </w:r>
-      <w:r>
-        <w:rPr>
-          <w:rFonts w:ascii="Times New Roman" w:hAnsi="Times New Roman" w:eastAsia="Times New Roman" w:cs="Times New Roman"/>
-          <w:sz w:val="24"/>
-          <w:szCs w:val="24"/>
-        </w:rPr>
-      </w:r>
+      <w:r/>
     </w:p>
     <w:p>
       <w:pPr>
-        <w:pStyle w:val="867"/>
+        <w:pStyle w:val="929"/>
         <w:numPr>
           <w:ilvl w:val="0"/>
           <w:numId w:val="0"/>
@@ -20736,11 +20782,19 @@
           <w14:ligatures w14:val="none"/>
         </w:rPr>
       </w:pPr>
-      <w:r/>
       <w:r>
         <w:t xml:space="preserve">DAFTAR PUSTAKA</w:t>
       </w:r>
-      <w:r/>
+      <w:r>
+        <w:rPr>
+          <w14:ligatures w14:val="none"/>
+        </w:rPr>
+      </w:r>
+      <w:r>
+        <w:rPr>
+          <w14:ligatures w14:val="none"/>
+        </w:rPr>
+      </w:r>
     </w:p>
     <w:p>
       <w:pPr>
@@ -20782,7 +20836,7 @@
       <w:hyperlink r:id="rId12" w:tooltip="https://cjip.jatengprov.go.id/" w:history="1">
         <w:r>
           <w:rPr>
-            <w:rStyle w:val="912"/>
+            <w:rStyle w:val="974"/>
             <w:rFonts w:ascii="Times New Roman" w:hAnsi="Times New Roman" w:eastAsia="Times New Roman" w:cs="Times New Roman"/>
             <w:color w:val="0000ee"/>
             <w:sz w:val="24"/>
@@ -22273,7 +22327,7 @@
         <w:spacing/>
         <w:ind w:hanging="360" w:left="709"/>
       </w:pPr>
-      <w:pStyle w:val="867"/>
+      <w:pStyle w:val="929"/>
       <w:rPr/>
       <w:start w:val="1"/>
       <w:suff w:val="tab"/>
@@ -22532,7 +22586,7 @@
         <w:spacing/>
         <w:ind w:hanging="360" w:left="720"/>
       </w:pPr>
-      <w:pStyle w:val="930"/>
+      <w:pStyle w:val="992"/>
       <w:rPr/>
       <w:start w:val="1"/>
       <w:suff w:val="tab"/>
@@ -28250,9 +28304,9 @@
     <w:lsdException w:name="Bibliography" w:uiPriority="37"/>
     <w:lsdException w:name="TOC Heading" w:uiPriority="39" w:qFormat="1"/>
   </w:latentStyles>
-  <w:style w:type="table" w:styleId="741">
+  <w:style w:type="table" w:styleId="803">
     <w:name w:val="Table Grid"/>
-    <w:basedOn w:val="927"/>
+    <w:basedOn w:val="989"/>
     <w:uiPriority w:val="59"/>
     <w:pPr>
       <w:pBdr/>
@@ -28449,9 +28503,9 @@
       </w:tcPr>
     </w:tblStylePr>
   </w:style>
-  <w:style w:type="table" w:styleId="742">
+  <w:style w:type="table" w:styleId="804">
     <w:name w:val="Table Grid Light"/>
-    <w:basedOn w:val="927"/>
+    <w:basedOn w:val="989"/>
     <w:uiPriority w:val="59"/>
     <w:pPr>
       <w:pBdr/>
@@ -28648,9 +28702,9 @@
       </w:tcPr>
     </w:tblStylePr>
   </w:style>
-  <w:style w:type="table" w:styleId="743">
+  <w:style w:type="table" w:styleId="805">
     <w:name w:val="Plain Table 1"/>
-    <w:basedOn w:val="927"/>
+    <w:basedOn w:val="989"/>
     <w:uiPriority w:val="59"/>
     <w:pPr>
       <w:pBdr/>
@@ -28873,9 +28927,9 @@
       </w:tcPr>
     </w:tblStylePr>
   </w:style>
-  <w:style w:type="table" w:styleId="744">
+  <w:style w:type="table" w:styleId="806">
     <w:name w:val="Plain Table 2"/>
-    <w:basedOn w:val="927"/>
+    <w:basedOn w:val="989"/>
     <w:uiPriority w:val="59"/>
     <w:pPr>
       <w:pBdr/>
@@ -29106,9 +29160,9 @@
       </w:tcPr>
     </w:tblStylePr>
   </w:style>
-  <w:style w:type="table" w:styleId="745">
+  <w:style w:type="table" w:styleId="807">
     <w:name w:val="Plain Table 3"/>
-    <w:basedOn w:val="927"/>
+    <w:basedOn w:val="989"/>
     <w:uiPriority w:val="99"/>
     <w:pPr>
       <w:pBdr/>
@@ -29336,9 +29390,9 @@
       </w:tcPr>
     </w:tblStylePr>
   </w:style>
-  <w:style w:type="table" w:styleId="746">
+  <w:style w:type="table" w:styleId="808">
     <w:name w:val="Plain Table 4"/>
-    <w:basedOn w:val="927"/>
+    <w:basedOn w:val="989"/>
     <w:uiPriority w:val="99"/>
     <w:pPr>
       <w:pBdr/>
@@ -29552,9 +29606,9 @@
       </w:tcPr>
     </w:tblStylePr>
   </w:style>
-  <w:style w:type="table" w:styleId="747">
+  <w:style w:type="table" w:styleId="809">
     <w:name w:val="Plain Table 5"/>
-    <w:basedOn w:val="927"/>
+    <w:basedOn w:val="989"/>
     <w:uiPriority w:val="99"/>
     <w:pPr>
       <w:pBdr/>
@@ -29785,9 +29839,9 @@
       </w:tcPr>
     </w:tblStylePr>
   </w:style>
-  <w:style w:type="table" w:styleId="748">
+  <w:style w:type="table" w:styleId="810">
     <w:name w:val="Grid Table 1 Light"/>
-    <w:basedOn w:val="927"/>
+    <w:basedOn w:val="989"/>
     <w:uiPriority w:val="99"/>
     <w:pPr>
       <w:pBdr/>
@@ -30008,9 +30062,9 @@
       </w:tcPr>
     </w:tblStylePr>
   </w:style>
-  <w:style w:type="table" w:styleId="749">
+  <w:style w:type="table" w:styleId="811">
     <w:name w:val="Grid Table 1 Light - Accent 1"/>
-    <w:basedOn w:val="927"/>
+    <w:basedOn w:val="989"/>
     <w:uiPriority w:val="99"/>
     <w:pPr>
       <w:pBdr/>
@@ -30231,9 +30285,9 @@
       </w:tcPr>
     </w:tblStylePr>
   </w:style>
-  <w:style w:type="table" w:styleId="750">
+  <w:style w:type="table" w:styleId="812">
     <w:name w:val="Grid Table 1 Light - Accent 2"/>
-    <w:basedOn w:val="927"/>
+    <w:basedOn w:val="989"/>
     <w:uiPriority w:val="99"/>
     <w:pPr>
       <w:pBdr/>
@@ -30454,9 +30508,9 @@
       </w:tcPr>
     </w:tblStylePr>
   </w:style>
-  <w:style w:type="table" w:styleId="751">
+  <w:style w:type="table" w:styleId="813">
     <w:name w:val="Grid Table 1 Light - Accent 3"/>
-    <w:basedOn w:val="927"/>
+    <w:basedOn w:val="989"/>
     <w:uiPriority w:val="99"/>
     <w:pPr>
       <w:pBdr/>
@@ -30677,9 +30731,9 @@
       </w:tcPr>
     </w:tblStylePr>
   </w:style>
-  <w:style w:type="table" w:styleId="752">
+  <w:style w:type="table" w:styleId="814">
     <w:name w:val="Grid Table 1 Light - Accent 4"/>
-    <w:basedOn w:val="927"/>
+    <w:basedOn w:val="989"/>
     <w:uiPriority w:val="99"/>
     <w:pPr>
       <w:pBdr/>
@@ -30900,9 +30954,9 @@
       </w:tcPr>
     </w:tblStylePr>
   </w:style>
-  <w:style w:type="table" w:styleId="753">
+  <w:style w:type="table" w:styleId="815">
     <w:name w:val="Grid Table 1 Light - Accent 5"/>
-    <w:basedOn w:val="927"/>
+    <w:basedOn w:val="989"/>
     <w:uiPriority w:val="99"/>
     <w:pPr>
       <w:pBdr/>
@@ -31123,9 +31177,9 @@
       </w:tcPr>
     </w:tblStylePr>
   </w:style>
-  <w:style w:type="table" w:styleId="754">
+  <w:style w:type="table" w:styleId="816">
     <w:name w:val="Grid Table 1 Light - Accent 6"/>
-    <w:basedOn w:val="927"/>
+    <w:basedOn w:val="989"/>
     <w:uiPriority w:val="99"/>
     <w:pPr>
       <w:pBdr/>
@@ -31346,9 +31400,9 @@
       </w:tcPr>
     </w:tblStylePr>
   </w:style>
-  <w:style w:type="table" w:styleId="755">
+  <w:style w:type="table" w:styleId="817">
     <w:name w:val="Grid Table 2"/>
-    <w:basedOn w:val="927"/>
+    <w:basedOn w:val="989"/>
     <w:uiPriority w:val="99"/>
     <w:pPr>
       <w:pBdr/>
@@ -31578,9 +31632,9 @@
       </w:tcPr>
     </w:tblStylePr>
   </w:style>
-  <w:style w:type="table" w:styleId="756">
+  <w:style w:type="table" w:styleId="818">
     <w:name w:val="Grid Table 2 - Accent 1"/>
-    <w:basedOn w:val="927"/>
+    <w:basedOn w:val="989"/>
     <w:uiPriority w:val="99"/>
     <w:pPr>
       <w:pBdr/>
@@ -31810,9 +31864,9 @@
       </w:tcPr>
     </w:tblStylePr>
   </w:style>
-  <w:style w:type="table" w:styleId="757">
+  <w:style w:type="table" w:styleId="819">
     <w:name w:val="Grid Table 2 - Accent 2"/>
-    <w:basedOn w:val="927"/>
+    <w:basedOn w:val="989"/>
     <w:uiPriority w:val="99"/>
     <w:pPr>
       <w:pBdr/>
@@ -32042,9 +32096,9 @@
       </w:tcPr>
     </w:tblStylePr>
   </w:style>
-  <w:style w:type="table" w:styleId="758">
+  <w:style w:type="table" w:styleId="820">
     <w:name w:val="Grid Table 2 - Accent 3"/>
-    <w:basedOn w:val="927"/>
+    <w:basedOn w:val="989"/>
     <w:uiPriority w:val="99"/>
     <w:pPr>
       <w:pBdr/>
@@ -32274,9 +32328,9 @@
       </w:tcPr>
     </w:tblStylePr>
   </w:style>
-  <w:style w:type="table" w:styleId="759">
+  <w:style w:type="table" w:styleId="821">
     <w:name w:val="Grid Table 2 - Accent 4"/>
-    <w:basedOn w:val="927"/>
+    <w:basedOn w:val="989"/>
     <w:uiPriority w:val="99"/>
     <w:pPr>
       <w:pBdr/>
@@ -32506,9 +32560,9 @@
       </w:tcPr>
     </w:tblStylePr>
   </w:style>
-  <w:style w:type="table" w:styleId="760">
+  <w:style w:type="table" w:styleId="822">
     <w:name w:val="Grid Table 2 - Accent 5"/>
-    <w:basedOn w:val="927"/>
+    <w:basedOn w:val="989"/>
     <w:uiPriority w:val="99"/>
     <w:pPr>
       <w:pBdr/>
@@ -32738,9 +32792,9 @@
       </w:tcPr>
     </w:tblStylePr>
   </w:style>
-  <w:style w:type="table" w:styleId="761">
+  <w:style w:type="table" w:styleId="823">
     <w:name w:val="Grid Table 2 - Accent 6"/>
-    <w:basedOn w:val="927"/>
+    <w:basedOn w:val="989"/>
     <w:uiPriority w:val="99"/>
     <w:pPr>
       <w:pBdr/>
@@ -32970,9 +33024,9 @@
       </w:tcPr>
     </w:tblStylePr>
   </w:style>
-  <w:style w:type="table" w:styleId="762">
+  <w:style w:type="table" w:styleId="824">
     <w:name w:val="Grid Table 3"/>
-    <w:basedOn w:val="927"/>
+    <w:basedOn w:val="989"/>
     <w:uiPriority w:val="99"/>
     <w:pPr>
       <w:pBdr/>
@@ -33215,9 +33269,9 @@
       </w:tcPr>
     </w:tblStylePr>
   </w:style>
-  <w:style w:type="table" w:styleId="763">
+  <w:style w:type="table" w:styleId="825">
     <w:name w:val="Grid Table 3 - Accent 1"/>
-    <w:basedOn w:val="927"/>
+    <w:basedOn w:val="989"/>
     <w:uiPriority w:val="99"/>
     <w:pPr>
       <w:pBdr/>
@@ -33460,9 +33514,9 @@
       </w:tcPr>
     </w:tblStylePr>
   </w:style>
-  <w:style w:type="table" w:styleId="764">
+  <w:style w:type="table" w:styleId="826">
     <w:name w:val="Grid Table 3 - Accent 2"/>
-    <w:basedOn w:val="927"/>
+    <w:basedOn w:val="989"/>
     <w:uiPriority w:val="99"/>
     <w:pPr>
       <w:pBdr/>
@@ -33705,9 +33759,9 @@
       </w:tcPr>
     </w:tblStylePr>
   </w:style>
-  <w:style w:type="table" w:styleId="765">
+  <w:style w:type="table" w:styleId="827">
     <w:name w:val="Grid Table 3 - Accent 3"/>
-    <w:basedOn w:val="927"/>
+    <w:basedOn w:val="989"/>
     <w:uiPriority w:val="99"/>
     <w:pPr>
       <w:pBdr/>
@@ -33950,9 +34004,9 @@
       </w:tcPr>
     </w:tblStylePr>
   </w:style>
-  <w:style w:type="table" w:styleId="766">
+  <w:style w:type="table" w:styleId="828">
     <w:name w:val="Grid Table 3 - Accent 4"/>
-    <w:basedOn w:val="927"/>
+    <w:basedOn w:val="989"/>
     <w:uiPriority w:val="99"/>
     <w:pPr>
       <w:pBdr/>
@@ -34195,9 +34249,9 @@
       </w:tcPr>
     </w:tblStylePr>
   </w:style>
-  <w:style w:type="table" w:styleId="767">
+  <w:style w:type="table" w:styleId="829">
     <w:name w:val="Grid Table 3 - Accent 5"/>
-    <w:basedOn w:val="927"/>
+    <w:basedOn w:val="989"/>
     <w:uiPriority w:val="99"/>
     <w:pPr>
       <w:pBdr/>
@@ -34440,9 +34494,9 @@
       </w:tcPr>
     </w:tblStylePr>
   </w:style>
-  <w:style w:type="table" w:styleId="768">
+  <w:style w:type="table" w:styleId="830">
     <w:name w:val="Grid Table 3 - Accent 6"/>
-    <w:basedOn w:val="927"/>
+    <w:basedOn w:val="989"/>
     <w:uiPriority w:val="99"/>
     <w:pPr>
       <w:pBdr/>
@@ -34685,9 +34739,9 @@
       </w:tcPr>
     </w:tblStylePr>
   </w:style>
-  <w:style w:type="table" w:styleId="769">
+  <w:style w:type="table" w:styleId="831">
     <w:name w:val="Grid Table 4"/>
-    <w:basedOn w:val="927"/>
+    <w:basedOn w:val="989"/>
     <w:uiPriority w:val="59"/>
     <w:pPr>
       <w:pBdr/>
@@ -34918,9 +34972,9 @@
       </w:tcPr>
     </w:tblStylePr>
   </w:style>
-  <w:style w:type="table" w:styleId="770">
+  <w:style w:type="table" w:styleId="832">
     <w:name w:val="Grid Table 4 - Accent 1"/>
-    <w:basedOn w:val="927"/>
+    <w:basedOn w:val="989"/>
     <w:uiPriority w:val="59"/>
     <w:pPr>
       <w:pBdr/>
@@ -35151,9 +35205,9 @@
       </w:tcPr>
     </w:tblStylePr>
   </w:style>
-  <w:style w:type="table" w:styleId="771">
+  <w:style w:type="table" w:styleId="833">
     <w:name w:val="Grid Table 4 - Accent 2"/>
-    <w:basedOn w:val="927"/>
+    <w:basedOn w:val="989"/>
     <w:uiPriority w:val="59"/>
     <w:pPr>
       <w:pBdr/>
@@ -35384,9 +35438,9 @@
       </w:tcPr>
     </w:tblStylePr>
   </w:style>
-  <w:style w:type="table" w:styleId="772">
+  <w:style w:type="table" w:styleId="834">
     <w:name w:val="Grid Table 4 - Accent 3"/>
-    <w:basedOn w:val="927"/>
+    <w:basedOn w:val="989"/>
     <w:uiPriority w:val="59"/>
     <w:pPr>
       <w:pBdr/>
@@ -35617,9 +35671,9 @@
       </w:tcPr>
     </w:tblStylePr>
   </w:style>
-  <w:style w:type="table" w:styleId="773">
+  <w:style w:type="table" w:styleId="835">
     <w:name w:val="Grid Table 4 - Accent 4"/>
-    <w:basedOn w:val="927"/>
+    <w:basedOn w:val="989"/>
     <w:uiPriority w:val="59"/>
     <w:pPr>
       <w:pBdr/>
@@ -35850,9 +35904,9 @@
       </w:tcPr>
     </w:tblStylePr>
   </w:style>
-  <w:style w:type="table" w:styleId="774">
+  <w:style w:type="table" w:styleId="836">
     <w:name w:val="Grid Table 4 - Accent 5"/>
-    <w:basedOn w:val="927"/>
+    <w:basedOn w:val="989"/>
     <w:uiPriority w:val="59"/>
     <w:pPr>
       <w:pBdr/>
@@ -36083,9 +36137,9 @@
       </w:tcPr>
     </w:tblStylePr>
   </w:style>
-  <w:style w:type="table" w:styleId="775">
+  <w:style w:type="table" w:styleId="837">
     <w:name w:val="Grid Table 4 - Accent 6"/>
-    <w:basedOn w:val="927"/>
+    <w:basedOn w:val="989"/>
     <w:uiPriority w:val="59"/>
     <w:pPr>
       <w:pBdr/>
@@ -36316,9 +36370,9 @@
       </w:tcPr>
     </w:tblStylePr>
   </w:style>
-  <w:style w:type="table" w:styleId="776">
+  <w:style w:type="table" w:styleId="838">
     <w:name w:val="Grid Table 5 Dark"/>
-    <w:basedOn w:val="927"/>
+    <w:basedOn w:val="989"/>
     <w:uiPriority w:val="99"/>
     <w:pPr>
       <w:pBdr/>
@@ -36544,9 +36598,9 @@
       </w:tcPr>
     </w:tblStylePr>
   </w:style>
-  <w:style w:type="table" w:styleId="777">
+  <w:style w:type="table" w:styleId="839">
     <w:name w:val="Grid Table 5 Dark- Accent 1"/>
-    <w:basedOn w:val="927"/>
+    <w:basedOn w:val="989"/>
     <w:uiPriority w:val="99"/>
     <w:pPr>
       <w:pBdr/>
@@ -36772,9 +36826,9 @@
       </w:tcPr>
     </w:tblStylePr>
   </w:style>
-  <w:style w:type="table" w:styleId="778">
+  <w:style w:type="table" w:styleId="840">
     <w:name w:val="Grid Table 5 Dark - Accent 2"/>
-    <w:basedOn w:val="927"/>
+    <w:basedOn w:val="989"/>
     <w:uiPriority w:val="99"/>
     <w:pPr>
       <w:pBdr/>
@@ -37000,9 +37054,9 @@
       </w:tcPr>
     </w:tblStylePr>
   </w:style>
-  <w:style w:type="table" w:styleId="779">
+  <w:style w:type="table" w:styleId="841">
     <w:name w:val="Grid Table 5 Dark - Accent 3"/>
-    <w:basedOn w:val="927"/>
+    <w:basedOn w:val="989"/>
     <w:uiPriority w:val="99"/>
     <w:pPr>
       <w:pBdr/>
@@ -37228,9 +37282,9 @@
       </w:tcPr>
     </w:tblStylePr>
   </w:style>
-  <w:style w:type="table" w:styleId="780">
+  <w:style w:type="table" w:styleId="842">
     <w:name w:val="Grid Table 5 Dark- Accent 4"/>
-    <w:basedOn w:val="927"/>
+    <w:basedOn w:val="989"/>
     <w:uiPriority w:val="99"/>
     <w:pPr>
       <w:pBdr/>
@@ -37456,9 +37510,9 @@
       </w:tcPr>
     </w:tblStylePr>
   </w:style>
-  <w:style w:type="table" w:styleId="781">
+  <w:style w:type="table" w:styleId="843">
     <w:name w:val="Grid Table 5 Dark - Accent 5"/>
-    <w:basedOn w:val="927"/>
+    <w:basedOn w:val="989"/>
     <w:uiPriority w:val="99"/>
     <w:pPr>
       <w:pBdr/>
@@ -37684,9 +37738,9 @@
       </w:tcPr>
     </w:tblStylePr>
   </w:style>
-  <w:style w:type="table" w:styleId="782">
+  <w:style w:type="table" w:styleId="844">
     <w:name w:val="Grid Table 5 Dark - Accent 6"/>
-    <w:basedOn w:val="927"/>
+    <w:basedOn w:val="989"/>
     <w:uiPriority w:val="99"/>
     <w:pPr>
       <w:pBdr/>
@@ -37912,9 +37966,9 @@
       </w:tcPr>
     </w:tblStylePr>
   </w:style>
-  <w:style w:type="table" w:styleId="783">
+  <w:style w:type="table" w:styleId="845">
     <w:name w:val="Grid Table 6 Colorful"/>
-    <w:basedOn w:val="927"/>
+    <w:basedOn w:val="989"/>
     <w:uiPriority w:val="99"/>
     <w:pPr>
       <w:pBdr/>
@@ -38142,9 +38196,9 @@
       </w:tcPr>
     </w:tblStylePr>
   </w:style>
-  <w:style w:type="table" w:styleId="784">
+  <w:style w:type="table" w:styleId="846">
     <w:name w:val="Grid Table 6 Colorful - Accent 1"/>
-    <w:basedOn w:val="927"/>
+    <w:basedOn w:val="989"/>
     <w:uiPriority w:val="99"/>
     <w:pPr>
       <w:pBdr/>
@@ -38372,9 +38426,9 @@
       </w:tcPr>
     </w:tblStylePr>
   </w:style>
-  <w:style w:type="table" w:styleId="785">
+  <w:style w:type="table" w:styleId="847">
     <w:name w:val="Grid Table 6 Colorful - Accent 2"/>
-    <w:basedOn w:val="927"/>
+    <w:basedOn w:val="989"/>
     <w:uiPriority w:val="99"/>
     <w:pPr>
       <w:pBdr/>
@@ -38602,9 +38656,9 @@
       </w:tcPr>
     </w:tblStylePr>
   </w:style>
-  <w:style w:type="table" w:styleId="786">
+  <w:style w:type="table" w:styleId="848">
     <w:name w:val="Grid Table 6 Colorful - Accent 3"/>
-    <w:basedOn w:val="927"/>
+    <w:basedOn w:val="989"/>
     <w:uiPriority w:val="99"/>
     <w:pPr>
       <w:pBdr/>
@@ -38832,9 +38886,9 @@
       </w:tcPr>
     </w:tblStylePr>
   </w:style>
-  <w:style w:type="table" w:styleId="787">
+  <w:style w:type="table" w:styleId="849">
     <w:name w:val="Grid Table 6 Colorful - Accent 4"/>
-    <w:basedOn w:val="927"/>
+    <w:basedOn w:val="989"/>
     <w:uiPriority w:val="99"/>
     <w:pPr>
       <w:pBdr/>
@@ -39062,9 +39116,9 @@
       </w:tcPr>
     </w:tblStylePr>
   </w:style>
-  <w:style w:type="table" w:styleId="788">
+  <w:style w:type="table" w:styleId="850">
     <w:name w:val="Grid Table 6 Colorful - Accent 5"/>
-    <w:basedOn w:val="927"/>
+    <w:basedOn w:val="989"/>
     <w:uiPriority w:val="99"/>
     <w:pPr>
       <w:pBdr/>
@@ -39292,9 +39346,9 @@
       </w:tcPr>
     </w:tblStylePr>
   </w:style>
-  <w:style w:type="table" w:styleId="789">
+  <w:style w:type="table" w:styleId="851">
     <w:name w:val="Grid Table 6 Colorful - Accent 6"/>
-    <w:basedOn w:val="927"/>
+    <w:basedOn w:val="989"/>
     <w:uiPriority w:val="99"/>
     <w:pPr>
       <w:pBdr/>
@@ -39522,9 +39576,9 @@
       </w:tcPr>
     </w:tblStylePr>
   </w:style>
-  <w:style w:type="table" w:styleId="790">
+  <w:style w:type="table" w:styleId="852">
     <w:name w:val="Grid Table 7 Colorful"/>
-    <w:basedOn w:val="927"/>
+    <w:basedOn w:val="989"/>
     <w:uiPriority w:val="99"/>
     <w:pPr>
       <w:pBdr/>
@@ -39776,9 +39830,9 @@
       </w:tcPr>
     </w:tblStylePr>
   </w:style>
-  <w:style w:type="table" w:styleId="791">
+  <w:style w:type="table" w:styleId="853">
     <w:name w:val="Grid Table 7 Colorful - Accent 1"/>
-    <w:basedOn w:val="927"/>
+    <w:basedOn w:val="989"/>
     <w:uiPriority w:val="99"/>
     <w:pPr>
       <w:pBdr/>
@@ -40030,9 +40084,9 @@
       </w:tcPr>
     </w:tblStylePr>
   </w:style>
-  <w:style w:type="table" w:styleId="792">
+  <w:style w:type="table" w:styleId="854">
     <w:name w:val="Grid Table 7 Colorful - Accent 2"/>
-    <w:basedOn w:val="927"/>
+    <w:basedOn w:val="989"/>
     <w:uiPriority w:val="99"/>
     <w:pPr>
       <w:pBdr/>
@@ -40284,9 +40338,9 @@
       </w:tcPr>
     </w:tblStylePr>
   </w:style>
-  <w:style w:type="table" w:styleId="793">
+  <w:style w:type="table" w:styleId="855">
     <w:name w:val="Grid Table 7 Colorful - Accent 3"/>
-    <w:basedOn w:val="927"/>
+    <w:basedOn w:val="989"/>
     <w:uiPriority w:val="99"/>
     <w:pPr>
       <w:pBdr/>
@@ -40538,9 +40592,9 @@
       </w:tcPr>
     </w:tblStylePr>
   </w:style>
-  <w:style w:type="table" w:styleId="794">
+  <w:style w:type="table" w:styleId="856">
     <w:name w:val="Grid Table 7 Colorful - Accent 4"/>
-    <w:basedOn w:val="927"/>
+    <w:basedOn w:val="989"/>
     <w:uiPriority w:val="99"/>
     <w:pPr>
       <w:pBdr/>
@@ -40792,9 +40846,9 @@
       </w:tcPr>
     </w:tblStylePr>
   </w:style>
-  <w:style w:type="table" w:styleId="795">
+  <w:style w:type="table" w:styleId="857">
     <w:name w:val="Grid Table 7 Colorful - Accent 5"/>
-    <w:basedOn w:val="927"/>
+    <w:basedOn w:val="989"/>
     <w:uiPriority w:val="99"/>
     <w:pPr>
       <w:pBdr/>
@@ -41046,9 +41100,9 @@
       </w:tcPr>
     </w:tblStylePr>
   </w:style>
-  <w:style w:type="table" w:styleId="796">
+  <w:style w:type="table" w:styleId="858">
     <w:name w:val="Grid Table 7 Colorful - Accent 6"/>
-    <w:basedOn w:val="927"/>
+    <w:basedOn w:val="989"/>
     <w:uiPriority w:val="99"/>
     <w:pPr>
       <w:pBdr/>
@@ -41300,9 +41354,9 @@
       </w:tcPr>
     </w:tblStylePr>
   </w:style>
-  <w:style w:type="table" w:styleId="797">
+  <w:style w:type="table" w:styleId="859">
     <w:name w:val="List Table 1 Light"/>
-    <w:basedOn w:val="927"/>
+    <w:basedOn w:val="989"/>
     <w:uiPriority w:val="99"/>
     <w:pPr>
       <w:pBdr/>
@@ -41516,9 +41570,9 @@
       </w:tcPr>
     </w:tblStylePr>
   </w:style>
-  <w:style w:type="table" w:styleId="798">
+  <w:style w:type="table" w:styleId="860">
     <w:name w:val="List Table 1 Light - Accent 1"/>
-    <w:basedOn w:val="927"/>
+    <w:basedOn w:val="989"/>
     <w:uiPriority w:val="99"/>
     <w:pPr>
       <w:pBdr/>
@@ -41732,9 +41786,9 @@
       </w:tcPr>
     </w:tblStylePr>
   </w:style>
-  <w:style w:type="table" w:styleId="799">
+  <w:style w:type="table" w:styleId="861">
     <w:name w:val="List Table 1 Light - Accent 2"/>
-    <w:basedOn w:val="927"/>
+    <w:basedOn w:val="989"/>
     <w:uiPriority w:val="99"/>
     <w:pPr>
       <w:pBdr/>
@@ -41948,9 +42002,9 @@
       </w:tcPr>
     </w:tblStylePr>
   </w:style>
-  <w:style w:type="table" w:styleId="800">
+  <w:style w:type="table" w:styleId="862">
     <w:name w:val="List Table 1 Light - Accent 3"/>
-    <w:basedOn w:val="927"/>
+    <w:basedOn w:val="989"/>
     <w:uiPriority w:val="99"/>
     <w:pPr>
       <w:pBdr/>
@@ -42164,9 +42218,9 @@
       </w:tcPr>
     </w:tblStylePr>
   </w:style>
-  <w:style w:type="table" w:styleId="801">
+  <w:style w:type="table" w:styleId="863">
     <w:name w:val="List Table 1 Light - Accent 4"/>
-    <w:basedOn w:val="927"/>
+    <w:basedOn w:val="989"/>
     <w:uiPriority w:val="99"/>
     <w:pPr>
       <w:pBdr/>
@@ -42380,9 +42434,9 @@
       </w:tcPr>
     </w:tblStylePr>
   </w:style>
-  <w:style w:type="table" w:styleId="802">
+  <w:style w:type="table" w:styleId="864">
     <w:name w:val="List Table 1 Light - Accent 5"/>
-    <w:basedOn w:val="927"/>
+    <w:basedOn w:val="989"/>
     <w:uiPriority w:val="99"/>
     <w:pPr>
       <w:pBdr/>
@@ -42596,9 +42650,9 @@
       </w:tcPr>
     </w:tblStylePr>
   </w:style>
-  <w:style w:type="table" w:styleId="803">
+  <w:style w:type="table" w:styleId="865">
     <w:name w:val="List Table 1 Light - Accent 6"/>
-    <w:basedOn w:val="927"/>
+    <w:basedOn w:val="989"/>
     <w:uiPriority w:val="99"/>
     <w:pPr>
       <w:pBdr/>
@@ -42812,9 +42866,9 @@
       </w:tcPr>
     </w:tblStylePr>
   </w:style>
-  <w:style w:type="table" w:styleId="804">
+  <w:style w:type="table" w:styleId="866">
     <w:name w:val="List Table 2"/>
-    <w:basedOn w:val="927"/>
+    <w:basedOn w:val="989"/>
     <w:uiPriority w:val="99"/>
     <w:pPr>
       <w:pBdr/>
@@ -43050,9 +43104,9 @@
       </w:tcPr>
     </w:tblStylePr>
   </w:style>
-  <w:style w:type="table" w:styleId="805">
+  <w:style w:type="table" w:styleId="867">
     <w:name w:val="List Table 2 - Accent 1"/>
-    <w:basedOn w:val="927"/>
+    <w:basedOn w:val="989"/>
     <w:uiPriority w:val="99"/>
     <w:pPr>
       <w:pBdr/>
@@ -43288,9 +43342,9 @@
       </w:tcPr>
     </w:tblStylePr>
   </w:style>
-  <w:style w:type="table" w:styleId="806">
+  <w:style w:type="table" w:styleId="868">
     <w:name w:val="List Table 2 - Accent 2"/>
-    <w:basedOn w:val="927"/>
+    <w:basedOn w:val="989"/>
     <w:uiPriority w:val="99"/>
     <w:pPr>
       <w:pBdr/>
@@ -43526,9 +43580,9 @@
       </w:tcPr>
     </w:tblStylePr>
   </w:style>
-  <w:style w:type="table" w:styleId="807">
+  <w:style w:type="table" w:styleId="869">
     <w:name w:val="List Table 2 - Accent 3"/>
-    <w:basedOn w:val="927"/>
+    <w:basedOn w:val="989"/>
     <w:uiPriority w:val="99"/>
     <w:pPr>
       <w:pBdr/>
@@ -43764,9 +43818,9 @@
       </w:tcPr>
     </w:tblStylePr>
   </w:style>
-  <w:style w:type="table" w:styleId="808">
+  <w:style w:type="table" w:styleId="870">
     <w:name w:val="List Table 2 - Accent 4"/>
-    <w:basedOn w:val="927"/>
+    <w:basedOn w:val="989"/>
     <w:uiPriority w:val="99"/>
     <w:pPr>
       <w:pBdr/>
@@ -44002,9 +44056,9 @@
       </w:tcPr>
     </w:tblStylePr>
   </w:style>
-  <w:style w:type="table" w:styleId="809">
+  <w:style w:type="table" w:styleId="871">
     <w:name w:val="List Table 2 - Accent 5"/>
-    <w:basedOn w:val="927"/>
+    <w:basedOn w:val="989"/>
     <w:uiPriority w:val="99"/>
     <w:pPr>
       <w:pBdr/>
@@ -44240,9 +44294,9 @@
       </w:tcPr>
     </w:tblStylePr>
   </w:style>
-  <w:style w:type="table" w:styleId="810">
+  <w:style w:type="table" w:styleId="872">
     <w:name w:val="List Table 2 - Accent 6"/>
-    <w:basedOn w:val="927"/>
+    <w:basedOn w:val="989"/>
     <w:uiPriority w:val="99"/>
     <w:pPr>
       <w:pBdr/>
@@ -44478,9 +44532,9 @@
       </w:tcPr>
     </w:tblStylePr>
   </w:style>
-  <w:style w:type="table" w:styleId="811">
+  <w:style w:type="table" w:styleId="873">
     <w:name w:val="List Table 3"/>
-    <w:basedOn w:val="927"/>
+    <w:basedOn w:val="989"/>
     <w:uiPriority w:val="99"/>
     <w:pPr>
       <w:pBdr/>
@@ -44706,9 +44760,9 @@
       </w:tcPr>
     </w:tblStylePr>
   </w:style>
-  <w:style w:type="table" w:styleId="812">
+  <w:style w:type="table" w:styleId="874">
     <w:name w:val="List Table 3 - Accent 1"/>
-    <w:basedOn w:val="927"/>
+    <w:basedOn w:val="989"/>
     <w:uiPriority w:val="99"/>
     <w:pPr>
       <w:pBdr/>
@@ -44934,9 +44988,9 @@
       </w:tcPr>
     </w:tblStylePr>
   </w:style>
-  <w:style w:type="table" w:styleId="813">
+  <w:style w:type="table" w:styleId="875">
     <w:name w:val="List Table 3 - Accent 2"/>
-    <w:basedOn w:val="927"/>
+    <w:basedOn w:val="989"/>
     <w:uiPriority w:val="99"/>
     <w:pPr>
       <w:pBdr/>
@@ -45162,9 +45216,9 @@
       </w:tcPr>
     </w:tblStylePr>
   </w:style>
-  <w:style w:type="table" w:styleId="814">
+  <w:style w:type="table" w:styleId="876">
     <w:name w:val="List Table 3 - Accent 3"/>
-    <w:basedOn w:val="927"/>
+    <w:basedOn w:val="989"/>
     <w:uiPriority w:val="99"/>
     <w:pPr>
       <w:pBdr/>
@@ -45390,9 +45444,9 @@
       </w:tcPr>
     </w:tblStylePr>
   </w:style>
-  <w:style w:type="table" w:styleId="815">
+  <w:style w:type="table" w:styleId="877">
     <w:name w:val="List Table 3 - Accent 4"/>
-    <w:basedOn w:val="927"/>
+    <w:basedOn w:val="989"/>
     <w:uiPriority w:val="99"/>
     <w:pPr>
       <w:pBdr/>
@@ -45618,9 +45672,9 @@
       </w:tcPr>
     </w:tblStylePr>
   </w:style>
-  <w:style w:type="table" w:styleId="816">
+  <w:style w:type="table" w:styleId="878">
     <w:name w:val="List Table 3 - Accent 5"/>
-    <w:basedOn w:val="927"/>
+    <w:basedOn w:val="989"/>
     <w:uiPriority w:val="99"/>
     <w:pPr>
       <w:pBdr/>
@@ -45846,9 +45900,9 @@
       </w:tcPr>
     </w:tblStylePr>
   </w:style>
-  <w:style w:type="table" w:styleId="817">
+  <w:style w:type="table" w:styleId="879">
     <w:name w:val="List Table 3 - Accent 6"/>
-    <w:basedOn w:val="927"/>
+    <w:basedOn w:val="989"/>
     <w:uiPriority w:val="99"/>
     <w:pPr>
       <w:pBdr/>
@@ -46074,9 +46128,9 @@
       </w:tcPr>
     </w:tblStylePr>
   </w:style>
-  <w:style w:type="table" w:styleId="818">
+  <w:style w:type="table" w:styleId="880">
     <w:name w:val="List Table 4"/>
-    <w:basedOn w:val="927"/>
+    <w:basedOn w:val="989"/>
     <w:uiPriority w:val="99"/>
     <w:pPr>
       <w:pBdr/>
@@ -46299,9 +46353,9 @@
       </w:tcPr>
     </w:tblStylePr>
   </w:style>
-  <w:style w:type="table" w:styleId="819">
+  <w:style w:type="table" w:styleId="881">
     <w:name w:val="List Table 4 - Accent 1"/>
-    <w:basedOn w:val="927"/>
+    <w:basedOn w:val="989"/>
     <w:uiPriority w:val="99"/>
     <w:pPr>
       <w:pBdr/>
@@ -46524,9 +46578,9 @@
       </w:tcPr>
     </w:tblStylePr>
   </w:style>
-  <w:style w:type="table" w:styleId="820">
+  <w:style w:type="table" w:styleId="882">
     <w:name w:val="List Table 4 - Accent 2"/>
-    <w:basedOn w:val="927"/>
+    <w:basedOn w:val="989"/>
     <w:uiPriority w:val="99"/>
     <w:pPr>
       <w:pBdr/>
@@ -46749,9 +46803,9 @@
       </w:tcPr>
     </w:tblStylePr>
   </w:style>
-  <w:style w:type="table" w:styleId="821">
+  <w:style w:type="table" w:styleId="883">
     <w:name w:val="List Table 4 - Accent 3"/>
-    <w:basedOn w:val="927"/>
+    <w:basedOn w:val="989"/>
     <w:uiPriority w:val="99"/>
     <w:pPr>
       <w:pBdr/>
@@ -46974,9 +47028,9 @@
       </w:tcPr>
     </w:tblStylePr>
   </w:style>
-  <w:style w:type="table" w:styleId="822">
+  <w:style w:type="table" w:styleId="884">
     <w:name w:val="List Table 4 - Accent 4"/>
-    <w:basedOn w:val="927"/>
+    <w:basedOn w:val="989"/>
     <w:uiPriority w:val="99"/>
     <w:pPr>
       <w:pBdr/>
@@ -47199,9 +47253,9 @@
       </w:tcPr>
     </w:tblStylePr>
   </w:style>
-  <w:style w:type="table" w:styleId="823">
+  <w:style w:type="table" w:styleId="885">
     <w:name w:val="List Table 4 - Accent 5"/>
-    <w:basedOn w:val="927"/>
+    <w:basedOn w:val="989"/>
     <w:uiPriority w:val="99"/>
     <w:pPr>
       <w:pBdr/>
@@ -47424,9 +47478,9 @@
       </w:tcPr>
     </w:tblStylePr>
   </w:style>
-  <w:style w:type="table" w:styleId="824">
+  <w:style w:type="table" w:styleId="886">
     <w:name w:val="List Table 4 - Accent 6"/>
-    <w:basedOn w:val="927"/>
+    <w:basedOn w:val="989"/>
     <w:uiPriority w:val="99"/>
     <w:pPr>
       <w:pBdr/>
@@ -47649,9 +47703,9 @@
       </w:tcPr>
     </w:tblStylePr>
   </w:style>
-  <w:style w:type="table" w:styleId="825">
+  <w:style w:type="table" w:styleId="887">
     <w:name w:val="List Table 5 Dark"/>
-    <w:basedOn w:val="927"/>
+    <w:basedOn w:val="989"/>
     <w:uiPriority w:val="99"/>
     <w:pPr>
       <w:pBdr/>
@@ -47891,9 +47945,9 @@
       </w:tcPr>
     </w:tblStylePr>
   </w:style>
-  <w:style w:type="table" w:styleId="826">
+  <w:style w:type="table" w:styleId="888">
     <w:name w:val="List Table 5 Dark - Accent 1"/>
-    <w:basedOn w:val="927"/>
+    <w:basedOn w:val="989"/>
     <w:uiPriority w:val="99"/>
     <w:pPr>
       <w:pBdr/>
@@ -48133,9 +48187,9 @@
       </w:tcPr>
     </w:tblStylePr>
   </w:style>
-  <w:style w:type="table" w:styleId="827">
+  <w:style w:type="table" w:styleId="889">
     <w:name w:val="List Table 5 Dark - Accent 2"/>
-    <w:basedOn w:val="927"/>
+    <w:basedOn w:val="989"/>
     <w:uiPriority w:val="99"/>
     <w:pPr>
       <w:pBdr/>
@@ -48375,9 +48429,9 @@
       </w:tcPr>
     </w:tblStylePr>
   </w:style>
-  <w:style w:type="table" w:styleId="828">
+  <w:style w:type="table" w:styleId="890">
     <w:name w:val="List Table 5 Dark - Accent 3"/>
-    <w:basedOn w:val="927"/>
+    <w:basedOn w:val="989"/>
     <w:uiPriority w:val="99"/>
     <w:pPr>
       <w:pBdr/>
@@ -48617,9 +48671,9 @@
       </w:tcPr>
     </w:tblStylePr>
   </w:style>
-  <w:style w:type="table" w:styleId="829">
+  <w:style w:type="table" w:styleId="891">
     <w:name w:val="List Table 5 Dark - Accent 4"/>
-    <w:basedOn w:val="927"/>
+    <w:basedOn w:val="989"/>
     <w:uiPriority w:val="99"/>
     <w:pPr>
       <w:pBdr/>
@@ -48859,9 +48913,9 @@
       </w:tcPr>
     </w:tblStylePr>
   </w:style>
-  <w:style w:type="table" w:styleId="830">
+  <w:style w:type="table" w:styleId="892">
     <w:name w:val="List Table 5 Dark - Accent 5"/>
-    <w:basedOn w:val="927"/>
+    <w:basedOn w:val="989"/>
     <w:uiPriority w:val="99"/>
     <w:pPr>
       <w:pBdr/>
@@ -49101,9 +49155,9 @@
       </w:tcPr>
     </w:tblStylePr>
   </w:style>
-  <w:style w:type="table" w:styleId="831">
+  <w:style w:type="table" w:styleId="893">
     <w:name w:val="List Table 5 Dark - Accent 6"/>
-    <w:basedOn w:val="927"/>
+    <w:basedOn w:val="989"/>
     <w:uiPriority w:val="99"/>
     <w:pPr>
       <w:pBdr/>
@@ -49343,9 +49397,9 @@
       </w:tcPr>
     </w:tblStylePr>
   </w:style>
-  <w:style w:type="table" w:styleId="832">
+  <w:style w:type="table" w:styleId="894">
     <w:name w:val="List Table 6 Colorful"/>
-    <w:basedOn w:val="927"/>
+    <w:basedOn w:val="989"/>
     <w:uiPriority w:val="99"/>
     <w:pPr>
       <w:pBdr/>
@@ -49566,9 +49620,9 @@
       </w:tcPr>
     </w:tblStylePr>
   </w:style>
-  <w:style w:type="table" w:styleId="833">
+  <w:style w:type="table" w:styleId="895">
     <w:name w:val="List Table 6 Colorful - Accent 1"/>
-    <w:basedOn w:val="927"/>
+    <w:basedOn w:val="989"/>
     <w:uiPriority w:val="99"/>
     <w:pPr>
       <w:pBdr/>
@@ -49789,9 +49843,9 @@
       </w:tcPr>
     </w:tblStylePr>
   </w:style>
-  <w:style w:type="table" w:styleId="834">
+  <w:style w:type="table" w:styleId="896">
     <w:name w:val="List Table 6 Colorful - Accent 2"/>
-    <w:basedOn w:val="927"/>
+    <w:basedOn w:val="989"/>
     <w:uiPriority w:val="99"/>
     <w:pPr>
       <w:pBdr/>
@@ -50012,9 +50066,9 @@
       </w:tcPr>
     </w:tblStylePr>
   </w:style>
-  <w:style w:type="table" w:styleId="835">
+  <w:style w:type="table" w:styleId="897">
     <w:name w:val="List Table 6 Colorful - Accent 3"/>
-    <w:basedOn w:val="927"/>
+    <w:basedOn w:val="989"/>
     <w:uiPriority w:val="99"/>
     <w:pPr>
       <w:pBdr/>
@@ -50235,9 +50289,9 @@
       </w:tcPr>
     </w:tblStylePr>
   </w:style>
-  <w:style w:type="table" w:styleId="836">
+  <w:style w:type="table" w:styleId="898">
     <w:name w:val="List Table 6 Colorful - Accent 4"/>
-    <w:basedOn w:val="927"/>
+    <w:basedOn w:val="989"/>
     <w:uiPriority w:val="99"/>
     <w:pPr>
       <w:pBdr/>
@@ -50458,9 +50512,9 @@
       </w:tcPr>
     </w:tblStylePr>
   </w:style>
-  <w:style w:type="table" w:styleId="837">
+  <w:style w:type="table" w:styleId="899">
     <w:name w:val="List Table 6 Colorful - Accent 5"/>
-    <w:basedOn w:val="927"/>
+    <w:basedOn w:val="989"/>
     <w:uiPriority w:val="99"/>
     <w:pPr>
       <w:pBdr/>
@@ -50681,9 +50735,9 @@
       </w:tcPr>
     </w:tblStylePr>
   </w:style>
-  <w:style w:type="table" w:styleId="838">
+  <w:style w:type="table" w:styleId="900">
     <w:name w:val="List Table 6 Colorful - Accent 6"/>
-    <w:basedOn w:val="927"/>
+    <w:basedOn w:val="989"/>
     <w:uiPriority w:val="99"/>
     <w:pPr>
       <w:pBdr/>
@@ -50904,9 +50958,9 @@
       </w:tcPr>
     </w:tblStylePr>
   </w:style>
-  <w:style w:type="table" w:styleId="839">
+  <w:style w:type="table" w:styleId="901">
     <w:name w:val="List Table 7 Colorful"/>
-    <w:basedOn w:val="927"/>
+    <w:basedOn w:val="989"/>
     <w:uiPriority w:val="99"/>
     <w:pPr>
       <w:pBdr/>
@@ -51160,9 +51214,9 @@
       </w:tcPr>
     </w:tblStylePr>
   </w:style>
-  <w:style w:type="table" w:styleId="840">
+  <w:style w:type="table" w:styleId="902">
     <w:name w:val="List Table 7 Colorful - Accent 1"/>
-    <w:basedOn w:val="927"/>
+    <w:basedOn w:val="989"/>
     <w:uiPriority w:val="99"/>
     <w:pPr>
       <w:pBdr/>
@@ -51416,9 +51470,9 @@
       </w:tcPr>
     </w:tblStylePr>
   </w:style>
-  <w:style w:type="table" w:styleId="841">
+  <w:style w:type="table" w:styleId="903">
     <w:name w:val="List Table 7 Colorful - Accent 2"/>
-    <w:basedOn w:val="927"/>
+    <w:basedOn w:val="989"/>
     <w:uiPriority w:val="99"/>
     <w:pPr>
       <w:pBdr/>
@@ -51672,9 +51726,9 @@
       </w:tcPr>
     </w:tblStylePr>
   </w:style>
-  <w:style w:type="table" w:styleId="842">
+  <w:style w:type="table" w:styleId="904">
     <w:name w:val="List Table 7 Colorful - Accent 3"/>
-    <w:basedOn w:val="927"/>
+    <w:basedOn w:val="989"/>
     <w:uiPriority w:val="99"/>
     <w:pPr>
       <w:pBdr/>
@@ -51928,9 +51982,9 @@
       </w:tcPr>
     </w:tblStylePr>
   </w:style>
-  <w:style w:type="table" w:styleId="843">
+  <w:style w:type="table" w:styleId="905">
     <w:name w:val="List Table 7 Colorful - Accent 4"/>
-    <w:basedOn w:val="927"/>
+    <w:basedOn w:val="989"/>
     <w:uiPriority w:val="99"/>
     <w:pPr>
       <w:pBdr/>
@@ -52184,9 +52238,9 @@
       </w:tcPr>
     </w:tblStylePr>
   </w:style>
-  <w:style w:type="table" w:styleId="844">
+  <w:style w:type="table" w:styleId="906">
     <w:name w:val="List Table 7 Colorful - Accent 5"/>
-    <w:basedOn w:val="927"/>
+    <w:basedOn w:val="989"/>
     <w:uiPriority w:val="99"/>
     <w:pPr>
       <w:pBdr/>
@@ -52440,9 +52494,9 @@
       </w:tcPr>
     </w:tblStylePr>
   </w:style>
-  <w:style w:type="table" w:styleId="845">
+  <w:style w:type="table" w:styleId="907">
     <w:name w:val="List Table 7 Colorful - Accent 6"/>
-    <w:basedOn w:val="927"/>
+    <w:basedOn w:val="989"/>
     <w:uiPriority w:val="99"/>
     <w:pPr>
       <w:pBdr/>
@@ -52696,9 +52750,9 @@
       </w:tcPr>
     </w:tblStylePr>
   </w:style>
-  <w:style w:type="table" w:styleId="846">
+  <w:style w:type="table" w:styleId="908">
     <w:name w:val="Lined - Accent"/>
-    <w:basedOn w:val="927"/>
+    <w:basedOn w:val="989"/>
     <w:uiPriority w:val="99"/>
     <w:pPr>
       <w:pBdr/>
@@ -52933,9 +52987,9 @@
       </w:tcPr>
     </w:tblStylePr>
   </w:style>
-  <w:style w:type="table" w:styleId="847">
+  <w:style w:type="table" w:styleId="909">
     <w:name w:val="Lined - Accent 1"/>
-    <w:basedOn w:val="927"/>
+    <w:basedOn w:val="989"/>
     <w:uiPriority w:val="99"/>
     <w:pPr>
       <w:pBdr/>
@@ -53170,9 +53224,9 @@
       </w:tcPr>
     </w:tblStylePr>
   </w:style>
-  <w:style w:type="table" w:styleId="848">
+  <w:style w:type="table" w:styleId="910">
     <w:name w:val="Lined - Accent 2"/>
-    <w:basedOn w:val="927"/>
+    <w:basedOn w:val="989"/>
     <w:uiPriority w:val="99"/>
     <w:pPr>
       <w:pBdr/>
@@ -53407,9 +53461,9 @@
       </w:tcPr>
     </w:tblStylePr>
   </w:style>
-  <w:style w:type="table" w:styleId="849">
+  <w:style w:type="table" w:styleId="911">
     <w:name w:val="Lined - Accent 3"/>
-    <w:basedOn w:val="927"/>
+    <w:basedOn w:val="989"/>
     <w:uiPriority w:val="99"/>
     <w:pPr>
       <w:pBdr/>
@@ -53644,9 +53698,9 @@
       </w:tcPr>
     </w:tblStylePr>
   </w:style>
-  <w:style w:type="table" w:styleId="850">
+  <w:style w:type="table" w:styleId="912">
     <w:name w:val="Lined - Accent 4"/>
-    <w:basedOn w:val="927"/>
+    <w:basedOn w:val="989"/>
     <w:uiPriority w:val="99"/>
     <w:pPr>
       <w:pBdr/>
@@ -53881,9 +53935,9 @@
       </w:tcPr>
     </w:tblStylePr>
   </w:style>
-  <w:style w:type="table" w:styleId="851">
+  <w:style w:type="table" w:styleId="913">
     <w:name w:val="Lined - Accent 5"/>
-    <w:basedOn w:val="927"/>
+    <w:basedOn w:val="989"/>
     <w:uiPriority w:val="99"/>
     <w:pPr>
       <w:pBdr/>
@@ -54118,9 +54172,9 @@
       </w:tcPr>
     </w:tblStylePr>
   </w:style>
-  <w:style w:type="table" w:styleId="852">
+  <w:style w:type="table" w:styleId="914">
     <w:name w:val="Lined - Accent 6"/>
-    <w:basedOn w:val="927"/>
+    <w:basedOn w:val="989"/>
     <w:uiPriority w:val="99"/>
     <w:pPr>
       <w:pBdr/>
@@ -54355,9 +54409,9 @@
       </w:tcPr>
     </w:tblStylePr>
   </w:style>
-  <w:style w:type="table" w:styleId="853">
+  <w:style w:type="table" w:styleId="915">
     <w:name w:val="Bordered &amp; Lined - Accent"/>
-    <w:basedOn w:val="927"/>
+    <w:basedOn w:val="989"/>
     <w:uiPriority w:val="99"/>
     <w:pPr>
       <w:pBdr/>
@@ -54599,9 +54653,9 @@
       </w:tcPr>
     </w:tblStylePr>
   </w:style>
-  <w:style w:type="table" w:styleId="854">
+  <w:style w:type="table" w:styleId="916">
     <w:name w:val="Bordered &amp; Lined - Accent 1"/>
-    <w:basedOn w:val="927"/>
+    <w:basedOn w:val="989"/>
     <w:uiPriority w:val="99"/>
     <w:pPr>
       <w:pBdr/>
@@ -54843,9 +54897,9 @@
       </w:tcPr>
     </w:tblStylePr>
   </w:style>
-  <w:style w:type="table" w:styleId="855">
+  <w:style w:type="table" w:styleId="917">
     <w:name w:val="Bordered &amp; Lined - Accent 2"/>
-    <w:basedOn w:val="927"/>
+    <w:basedOn w:val="989"/>
     <w:uiPriority w:val="99"/>
     <w:pPr>
       <w:pBdr/>
@@ -55087,9 +55141,9 @@
       </w:tcPr>
     </w:tblStylePr>
   </w:style>
-  <w:style w:type="table" w:styleId="856">
+  <w:style w:type="table" w:styleId="918">
     <w:name w:val="Bordered &amp; Lined - Accent 3"/>
-    <w:basedOn w:val="927"/>
+    <w:basedOn w:val="989"/>
     <w:uiPriority w:val="99"/>
     <w:pPr>
       <w:pBdr/>
@@ -55331,9 +55385,9 @@
       </w:tcPr>
     </w:tblStylePr>
   </w:style>
-  <w:style w:type="table" w:styleId="857">
+  <w:style w:type="table" w:styleId="919">
     <w:name w:val="Bordered &amp; Lined - Accent 4"/>
-    <w:basedOn w:val="927"/>
+    <w:basedOn w:val="989"/>
     <w:uiPriority w:val="99"/>
     <w:pPr>
       <w:pBdr/>
@@ -55575,9 +55629,9 @@
       </w:tcPr>
     </w:tblStylePr>
   </w:style>
-  <w:style w:type="table" w:styleId="858">
+  <w:style w:type="table" w:styleId="920">
     <w:name w:val="Bordered &amp; Lined - Accent 5"/>
-    <w:basedOn w:val="927"/>
+    <w:basedOn w:val="989"/>
     <w:uiPriority w:val="99"/>
     <w:pPr>
       <w:pBdr/>
@@ -55819,9 +55873,9 @@
       </w:tcPr>
     </w:tblStylePr>
   </w:style>
-  <w:style w:type="table" w:styleId="859">
+  <w:style w:type="table" w:styleId="921">
     <w:name w:val="Bordered &amp; Lined - Accent 6"/>
-    <w:basedOn w:val="927"/>
+    <w:basedOn w:val="989"/>
     <w:uiPriority w:val="99"/>
     <w:pPr>
       <w:pBdr/>
@@ -56063,9 +56117,9 @@
       </w:tcPr>
     </w:tblStylePr>
   </w:style>
-  <w:style w:type="table" w:styleId="860">
+  <w:style w:type="table" w:styleId="922">
     <w:name w:val="Bordered"/>
-    <w:basedOn w:val="927"/>
+    <w:basedOn w:val="989"/>
     <w:uiPriority w:val="99"/>
     <w:pPr>
       <w:pBdr/>
@@ -56294,9 +56348,9 @@
       </w:tcPr>
     </w:tblStylePr>
   </w:style>
-  <w:style w:type="table" w:styleId="861">
+  <w:style w:type="table" w:styleId="923">
     <w:name w:val="Bordered - Accent 1"/>
-    <w:basedOn w:val="927"/>
+    <w:basedOn w:val="989"/>
     <w:uiPriority w:val="99"/>
     <w:pPr>
       <w:pBdr/>
@@ -56525,9 +56579,9 @@
       </w:tcPr>
     </w:tblStylePr>
   </w:style>
-  <w:style w:type="table" w:styleId="862">
+  <w:style w:type="table" w:styleId="924">
     <w:name w:val="Bordered - Accent 2"/>
-    <w:basedOn w:val="927"/>
+    <w:basedOn w:val="989"/>
     <w:uiPriority w:val="99"/>
     <w:pPr>
       <w:pBdr/>
@@ -56756,9 +56810,9 @@
       </w:tcPr>
     </w:tblStylePr>
   </w:style>
-  <w:style w:type="table" w:styleId="863">
+  <w:style w:type="table" w:styleId="925">
     <w:name w:val="Bordered - Accent 3"/>
-    <w:basedOn w:val="927"/>
+    <w:basedOn w:val="989"/>
     <w:uiPriority w:val="99"/>
     <w:pPr>
       <w:pBdr/>
@@ -56987,9 +57041,9 @@
       </w:tcPr>
     </w:tblStylePr>
   </w:style>
-  <w:style w:type="table" w:styleId="864">
+  <w:style w:type="table" w:styleId="926">
     <w:name w:val="Bordered - Accent 4"/>
-    <w:basedOn w:val="927"/>
+    <w:basedOn w:val="989"/>
     <w:uiPriority w:val="99"/>
     <w:pPr>
       <w:pBdr/>
@@ -57218,9 +57272,9 @@
       </w:tcPr>
     </w:tblStylePr>
   </w:style>
-  <w:style w:type="table" w:styleId="865">
+  <w:style w:type="table" w:styleId="927">
     <w:name w:val="Bordered - Accent 5"/>
-    <w:basedOn w:val="927"/>
+    <w:basedOn w:val="989"/>
     <w:uiPriority w:val="99"/>
     <w:pPr>
       <w:pBdr/>
@@ -57449,9 +57503,9 @@
       </w:tcPr>
     </w:tblStylePr>
   </w:style>
-  <w:style w:type="table" w:styleId="866">
+  <w:style w:type="table" w:styleId="928">
     <w:name w:val="Bordered - Accent 6"/>
-    <w:basedOn w:val="927"/>
+    <w:basedOn w:val="989"/>
     <w:uiPriority w:val="99"/>
     <w:pPr>
       <w:pBdr/>
@@ -57680,11 +57734,11 @@
       </w:tcPr>
     </w:tblStylePr>
   </w:style>
-  <w:style w:type="paragraph" w:styleId="867">
+  <w:style w:type="paragraph" w:styleId="929">
     <w:name w:val="Heading 1"/>
-    <w:basedOn w:val="868"/>
-    <w:next w:val="926"/>
-    <w:link w:val="877"/>
+    <w:basedOn w:val="930"/>
+    <w:next w:val="988"/>
+    <w:link w:val="939"/>
     <w:uiPriority w:val="9"/>
     <w:qFormat/>
     <w:pPr>
@@ -57709,11 +57763,11 @@
       <w:szCs w:val="28"/>
     </w:rPr>
   </w:style>
-  <w:style w:type="paragraph" w:styleId="868">
+  <w:style w:type="paragraph" w:styleId="930">
     <w:name w:val="Heading 2"/>
-    <w:basedOn w:val="869"/>
-    <w:next w:val="926"/>
-    <w:link w:val="878"/>
+    <w:basedOn w:val="931"/>
+    <w:next w:val="988"/>
+    <w:link w:val="940"/>
     <w:uiPriority w:val="9"/>
     <w:unhideWhenUsed/>
     <w:qFormat/>
@@ -57735,11 +57789,11 @@
       <w:szCs w:val="24"/>
     </w:rPr>
   </w:style>
-  <w:style w:type="paragraph" w:styleId="869">
+  <w:style w:type="paragraph" w:styleId="931">
     <w:name w:val="Heading 3"/>
-    <w:basedOn w:val="926"/>
-    <w:next w:val="926"/>
-    <w:link w:val="879"/>
+    <w:basedOn w:val="988"/>
+    <w:next w:val="988"/>
+    <w:link w:val="941"/>
     <w:uiPriority w:val="9"/>
     <w:unhideWhenUsed/>
     <w:qFormat/>
@@ -57758,11 +57812,11 @@
       <w:szCs w:val="28"/>
     </w:rPr>
   </w:style>
-  <w:style w:type="paragraph" w:styleId="870">
+  <w:style w:type="paragraph" w:styleId="932">
     <w:name w:val="Heading 4"/>
-    <w:basedOn w:val="926"/>
-    <w:next w:val="926"/>
-    <w:link w:val="880"/>
+    <w:basedOn w:val="988"/>
+    <w:next w:val="988"/>
+    <w:link w:val="942"/>
     <w:uiPriority w:val="9"/>
     <w:unhideWhenUsed/>
     <w:qFormat/>
@@ -57781,11 +57835,11 @@
       <w:color w:val="0f4761" w:themeColor="accent1" w:themeShade="BF"/>
     </w:rPr>
   </w:style>
-  <w:style w:type="paragraph" w:styleId="871">
+  <w:style w:type="paragraph" w:styleId="933">
     <w:name w:val="Heading 5"/>
-    <w:basedOn w:val="926"/>
-    <w:next w:val="926"/>
-    <w:link w:val="881"/>
+    <w:basedOn w:val="988"/>
+    <w:next w:val="988"/>
+    <w:link w:val="943"/>
     <w:uiPriority w:val="9"/>
     <w:unhideWhenUsed/>
     <w:qFormat/>
@@ -57802,11 +57856,11 @@
       <w:color w:val="0f4761" w:themeColor="accent1" w:themeShade="BF"/>
     </w:rPr>
   </w:style>
-  <w:style w:type="paragraph" w:styleId="872">
+  <w:style w:type="paragraph" w:styleId="934">
     <w:name w:val="Heading 6"/>
-    <w:basedOn w:val="926"/>
-    <w:next w:val="926"/>
-    <w:link w:val="882"/>
+    <w:basedOn w:val="988"/>
+    <w:next w:val="988"/>
+    <w:link w:val="944"/>
     <w:uiPriority w:val="9"/>
     <w:unhideWhenUsed/>
     <w:qFormat/>
@@ -57825,11 +57879,11 @@
       <w:color w:val="595959" w:themeColor="text1" w:themeTint="A6"/>
     </w:rPr>
   </w:style>
-  <w:style w:type="paragraph" w:styleId="873">
+  <w:style w:type="paragraph" w:styleId="935">
     <w:name w:val="Heading 7"/>
-    <w:basedOn w:val="926"/>
-    <w:next w:val="926"/>
-    <w:link w:val="883"/>
+    <w:basedOn w:val="988"/>
+    <w:next w:val="988"/>
+    <w:link w:val="945"/>
     <w:uiPriority w:val="9"/>
     <w:unhideWhenUsed/>
     <w:qFormat/>
@@ -57846,11 +57900,11 @@
       <w:color w:val="595959" w:themeColor="text1" w:themeTint="A6"/>
     </w:rPr>
   </w:style>
-  <w:style w:type="paragraph" w:styleId="874">
+  <w:style w:type="paragraph" w:styleId="936">
     <w:name w:val="Heading 8"/>
-    <w:basedOn w:val="926"/>
-    <w:next w:val="926"/>
-    <w:link w:val="884"/>
+    <w:basedOn w:val="988"/>
+    <w:next w:val="988"/>
+    <w:link w:val="946"/>
     <w:uiPriority w:val="9"/>
     <w:unhideWhenUsed/>
     <w:qFormat/>
@@ -57869,11 +57923,11 @@
       <w:color w:val="272727" w:themeColor="text1" w:themeTint="D8"/>
     </w:rPr>
   </w:style>
-  <w:style w:type="paragraph" w:styleId="875">
+  <w:style w:type="paragraph" w:styleId="937">
     <w:name w:val="Heading 9"/>
-    <w:basedOn w:val="926"/>
-    <w:next w:val="926"/>
-    <w:link w:val="885"/>
+    <w:basedOn w:val="988"/>
+    <w:next w:val="988"/>
+    <w:link w:val="947"/>
     <w:uiPriority w:val="9"/>
     <w:unhideWhenUsed/>
     <w:qFormat/>
@@ -57892,7 +57946,7 @@
       <w:color w:val="272727" w:themeColor="text1" w:themeTint="D8"/>
     </w:rPr>
   </w:style>
-  <w:style w:type="character" w:styleId="876" w:default="1">
+  <w:style w:type="character" w:styleId="938" w:default="1">
     <w:name w:val="Default Paragraph Font"/>
     <w:uiPriority w:val="1"/>
     <w:semiHidden/>
@@ -57903,9 +57957,9 @@
       <w:ind/>
     </w:pPr>
   </w:style>
-  <w:style w:type="character" w:styleId="877">
+  <w:style w:type="character" w:styleId="939">
     <w:name w:val="Heading 1 Char"/>
-    <w:link w:val="867"/>
+    <w:link w:val="929"/>
     <w:uiPriority w:val="9"/>
     <w:pPr>
       <w:pBdr/>
@@ -57913,9 +57967,9 @@
       <w:ind/>
     </w:pPr>
   </w:style>
-  <w:style w:type="character" w:styleId="878">
+  <w:style w:type="character" w:styleId="940">
     <w:name w:val="Heading 2 Char"/>
-    <w:link w:val="868"/>
+    <w:link w:val="930"/>
     <w:uiPriority w:val="9"/>
     <w:pPr>
       <w:pBdr/>
@@ -57930,10 +57984,10 @@
       <w:szCs w:val="24"/>
     </w:rPr>
   </w:style>
-  <w:style w:type="character" w:styleId="879">
+  <w:style w:type="character" w:styleId="941">
     <w:name w:val="Heading 3 Char"/>
-    <w:basedOn w:val="876"/>
-    <w:link w:val="869"/>
+    <w:basedOn w:val="938"/>
+    <w:link w:val="931"/>
     <w:uiPriority w:val="9"/>
     <w:pPr>
       <w:pBdr/>
@@ -57947,10 +58001,10 @@
       <w:szCs w:val="28"/>
     </w:rPr>
   </w:style>
-  <w:style w:type="character" w:styleId="880">
+  <w:style w:type="character" w:styleId="942">
     <w:name w:val="Heading 4 Char"/>
-    <w:basedOn w:val="876"/>
-    <w:link w:val="870"/>
+    <w:basedOn w:val="938"/>
+    <w:link w:val="932"/>
     <w:uiPriority w:val="9"/>
     <w:pPr>
       <w:pBdr/>
@@ -57964,10 +58018,10 @@
       <w:color w:val="0f4761" w:themeColor="accent1" w:themeShade="BF"/>
     </w:rPr>
   </w:style>
-  <w:style w:type="character" w:styleId="881">
+  <w:style w:type="character" w:styleId="943">
     <w:name w:val="Heading 5 Char"/>
-    <w:basedOn w:val="876"/>
-    <w:link w:val="871"/>
+    <w:basedOn w:val="938"/>
+    <w:link w:val="933"/>
     <w:uiPriority w:val="9"/>
     <w:pPr>
       <w:pBdr/>
@@ -57979,10 +58033,10 @@
       <w:color w:val="0f4761" w:themeColor="accent1" w:themeShade="BF"/>
     </w:rPr>
   </w:style>
-  <w:style w:type="character" w:styleId="882">
+  <w:style w:type="character" w:styleId="944">
     <w:name w:val="Heading 6 Char"/>
-    <w:basedOn w:val="876"/>
-    <w:link w:val="872"/>
+    <w:basedOn w:val="938"/>
+    <w:link w:val="934"/>
     <w:uiPriority w:val="9"/>
     <w:pPr>
       <w:pBdr/>
@@ -57996,10 +58050,10 @@
       <w:color w:val="595959" w:themeColor="text1" w:themeTint="A6"/>
     </w:rPr>
   </w:style>
-  <w:style w:type="character" w:styleId="883">
+  <w:style w:type="character" w:styleId="945">
     <w:name w:val="Heading 7 Char"/>
-    <w:basedOn w:val="876"/>
-    <w:link w:val="873"/>
+    <w:basedOn w:val="938"/>
+    <w:link w:val="935"/>
     <w:uiPriority w:val="9"/>
     <w:pPr>
       <w:pBdr/>
@@ -58011,10 +58065,10 @@
       <w:color w:val="595959" w:themeColor="text1" w:themeTint="A6"/>
     </w:rPr>
   </w:style>
-  <w:style w:type="character" w:styleId="884">
+  <w:style w:type="character" w:styleId="946">
     <w:name w:val="Heading 8 Char"/>
-    <w:basedOn w:val="876"/>
-    <w:link w:val="874"/>
+    <w:basedOn w:val="938"/>
+    <w:link w:val="936"/>
     <w:uiPriority w:val="9"/>
     <w:pPr>
       <w:pBdr/>
@@ -58028,10 +58082,10 @@
       <w:color w:val="272727" w:themeColor="text1" w:themeTint="D8"/>
     </w:rPr>
   </w:style>
-  <w:style w:type="character" w:styleId="885">
+  <w:style w:type="character" w:styleId="947">
     <w:name w:val="Heading 9 Char"/>
-    <w:basedOn w:val="876"/>
-    <w:link w:val="875"/>
+    <w:basedOn w:val="938"/>
+    <w:link w:val="937"/>
     <w:uiPriority w:val="9"/>
     <w:pPr>
       <w:pBdr/>
@@ -58045,11 +58099,11 @@
       <w:color w:val="272727" w:themeColor="text1" w:themeTint="D8"/>
     </w:rPr>
   </w:style>
-  <w:style w:type="paragraph" w:styleId="886">
+  <w:style w:type="paragraph" w:styleId="948">
     <w:name w:val="Title"/>
-    <w:basedOn w:val="926"/>
-    <w:next w:val="926"/>
-    <w:link w:val="887"/>
+    <w:basedOn w:val="988"/>
+    <w:next w:val="988"/>
+    <w:link w:val="949"/>
     <w:uiPriority w:val="10"/>
     <w:qFormat/>
     <w:pPr>
@@ -58065,10 +58119,10 @@
       <w:szCs w:val="56"/>
     </w:rPr>
   </w:style>
-  <w:style w:type="character" w:styleId="887">
+  <w:style w:type="character" w:styleId="949">
     <w:name w:val="Title Char"/>
-    <w:basedOn w:val="876"/>
-    <w:link w:val="886"/>
+    <w:basedOn w:val="938"/>
+    <w:link w:val="948"/>
     <w:uiPriority w:val="10"/>
     <w:pPr>
       <w:pBdr/>
@@ -58082,11 +58136,11 @@
       <w:szCs w:val="56"/>
     </w:rPr>
   </w:style>
-  <w:style w:type="paragraph" w:styleId="888">
+  <w:style w:type="paragraph" w:styleId="950">
     <w:name w:val="Subtitle"/>
-    <w:basedOn w:val="926"/>
-    <w:next w:val="926"/>
-    <w:link w:val="889"/>
+    <w:basedOn w:val="988"/>
+    <w:next w:val="988"/>
+    <w:link w:val="951"/>
     <w:uiPriority w:val="11"/>
     <w:qFormat/>
     <w:pPr>
@@ -58104,10 +58158,10 @@
       <w:szCs w:val="28"/>
     </w:rPr>
   </w:style>
-  <w:style w:type="character" w:styleId="889">
+  <w:style w:type="character" w:styleId="951">
     <w:name w:val="Subtitle Char"/>
-    <w:basedOn w:val="876"/>
-    <w:link w:val="888"/>
+    <w:basedOn w:val="938"/>
+    <w:link w:val="950"/>
     <w:uiPriority w:val="11"/>
     <w:pPr>
       <w:pBdr/>
@@ -58121,11 +58175,11 @@
       <w:szCs w:val="28"/>
     </w:rPr>
   </w:style>
-  <w:style w:type="paragraph" w:styleId="890">
+  <w:style w:type="paragraph" w:styleId="952">
     <w:name w:val="Quote"/>
-    <w:basedOn w:val="926"/>
-    <w:next w:val="926"/>
-    <w:link w:val="891"/>
+    <w:basedOn w:val="988"/>
+    <w:next w:val="988"/>
+    <w:link w:val="953"/>
     <w:uiPriority w:val="29"/>
     <w:qFormat/>
     <w:pPr>
@@ -58140,10 +58194,10 @@
       <w:color w:val="404040" w:themeColor="text1" w:themeTint="BF"/>
     </w:rPr>
   </w:style>
-  <w:style w:type="character" w:styleId="891">
+  <w:style w:type="character" w:styleId="953">
     <w:name w:val="Quote Char"/>
-    <w:basedOn w:val="876"/>
-    <w:link w:val="890"/>
+    <w:basedOn w:val="938"/>
+    <w:link w:val="952"/>
     <w:uiPriority w:val="29"/>
     <w:pPr>
       <w:pBdr/>
@@ -58156,9 +58210,9 @@
       <w:color w:val="404040" w:themeColor="text1" w:themeTint="BF"/>
     </w:rPr>
   </w:style>
-  <w:style w:type="character" w:styleId="892">
+  <w:style w:type="character" w:styleId="954">
     <w:name w:val="Intense Emphasis"/>
-    <w:basedOn w:val="876"/>
+    <w:basedOn w:val="938"/>
     <w:uiPriority w:val="21"/>
     <w:qFormat/>
     <w:pPr>
@@ -58172,11 +58226,11 @@
       <w:color w:val="0f4761" w:themeColor="accent1" w:themeShade="BF"/>
     </w:rPr>
   </w:style>
-  <w:style w:type="paragraph" w:styleId="893">
+  <w:style w:type="paragraph" w:styleId="955">
     <w:name w:val="Intense Quote"/>
-    <w:basedOn w:val="926"/>
-    <w:next w:val="926"/>
-    <w:link w:val="894"/>
+    <w:basedOn w:val="988"/>
+    <w:next w:val="988"/>
+    <w:link w:val="956"/>
     <w:uiPriority w:val="30"/>
     <w:qFormat/>
     <w:pPr>
@@ -58194,10 +58248,10 @@
       <w:color w:val="0f4761" w:themeColor="accent1" w:themeShade="BF"/>
     </w:rPr>
   </w:style>
-  <w:style w:type="character" w:styleId="894">
+  <w:style w:type="character" w:styleId="956">
     <w:name w:val="Intense Quote Char"/>
-    <w:basedOn w:val="876"/>
-    <w:link w:val="893"/>
+    <w:basedOn w:val="938"/>
+    <w:link w:val="955"/>
     <w:uiPriority w:val="30"/>
     <w:pPr>
       <w:pBdr/>
@@ -58210,9 +58264,9 @@
       <w:color w:val="0f4761" w:themeColor="accent1" w:themeShade="BF"/>
     </w:rPr>
   </w:style>
-  <w:style w:type="character" w:styleId="895">
+  <w:style w:type="character" w:styleId="957">
     <w:name w:val="Intense Reference"/>
-    <w:basedOn w:val="876"/>
+    <w:basedOn w:val="938"/>
     <w:uiPriority w:val="32"/>
     <w:qFormat/>
     <w:pPr>
@@ -58228,9 +58282,9 @@
       <w:spacing w:val="5"/>
     </w:rPr>
   </w:style>
-  <w:style w:type="character" w:styleId="896">
+  <w:style w:type="character" w:styleId="958">
     <w:name w:val="Subtle Emphasis"/>
-    <w:basedOn w:val="876"/>
+    <w:basedOn w:val="938"/>
     <w:uiPriority w:val="19"/>
     <w:qFormat/>
     <w:pPr>
@@ -58244,9 +58298,9 @@
       <w:color w:val="404040" w:themeColor="text1" w:themeTint="BF"/>
     </w:rPr>
   </w:style>
-  <w:style w:type="character" w:styleId="897">
+  <w:style w:type="character" w:styleId="959">
     <w:name w:val="Emphasis"/>
-    <w:basedOn w:val="876"/>
+    <w:basedOn w:val="938"/>
     <w:uiPriority w:val="20"/>
     <w:qFormat/>
     <w:pPr>
@@ -58259,9 +58313,9 @@
       <w:iCs/>
     </w:rPr>
   </w:style>
-  <w:style w:type="character" w:styleId="898">
+  <w:style w:type="character" w:styleId="960">
     <w:name w:val="Strong"/>
-    <w:basedOn w:val="876"/>
+    <w:basedOn w:val="938"/>
     <w:uiPriority w:val="22"/>
     <w:qFormat/>
     <w:pPr>
@@ -58274,9 +58328,9 @@
       <w:bCs/>
     </w:rPr>
   </w:style>
-  <w:style w:type="character" w:styleId="899">
+  <w:style w:type="character" w:styleId="961">
     <w:name w:val="Subtle Reference"/>
-    <w:basedOn w:val="876"/>
+    <w:basedOn w:val="938"/>
     <w:uiPriority w:val="31"/>
     <w:qFormat/>
     <w:pPr>
@@ -58289,9 +58343,9 @@
       <w:color w:val="5a5a5a" w:themeColor="text1" w:themeTint="A5"/>
     </w:rPr>
   </w:style>
-  <w:style w:type="character" w:styleId="900">
+  <w:style w:type="character" w:styleId="962">
     <w:name w:val="Book Title"/>
-    <w:basedOn w:val="876"/>
+    <w:basedOn w:val="938"/>
     <w:uiPriority w:val="33"/>
     <w:qFormat/>
     <w:pPr>
@@ -58307,10 +58361,10 @@
       <w:spacing w:val="5"/>
     </w:rPr>
   </w:style>
-  <w:style w:type="paragraph" w:styleId="901">
+  <w:style w:type="paragraph" w:styleId="963">
     <w:name w:val="Header"/>
-    <w:basedOn w:val="926"/>
-    <w:link w:val="902"/>
+    <w:basedOn w:val="988"/>
+    <w:link w:val="964"/>
     <w:uiPriority w:val="99"/>
     <w:unhideWhenUsed/>
     <w:pPr>
@@ -58323,10 +58377,10 @@
       <w:ind/>
     </w:pPr>
   </w:style>
-  <w:style w:type="character" w:styleId="902">
+  <w:style w:type="character" w:styleId="964">
     <w:name w:val="Header Char"/>
-    <w:basedOn w:val="876"/>
-    <w:link w:val="901"/>
+    <w:basedOn w:val="938"/>
+    <w:link w:val="963"/>
     <w:uiPriority w:val="99"/>
     <w:pPr>
       <w:pBdr/>
@@ -58334,10 +58388,10 @@
       <w:ind/>
     </w:pPr>
   </w:style>
-  <w:style w:type="paragraph" w:styleId="903">
+  <w:style w:type="paragraph" w:styleId="965">
     <w:name w:val="Footer"/>
-    <w:basedOn w:val="926"/>
-    <w:link w:val="904"/>
+    <w:basedOn w:val="988"/>
+    <w:link w:val="966"/>
     <w:uiPriority w:val="99"/>
     <w:unhideWhenUsed/>
     <w:pPr>
@@ -58350,10 +58404,10 @@
       <w:ind/>
     </w:pPr>
   </w:style>
-  <w:style w:type="character" w:styleId="904">
+  <w:style w:type="character" w:styleId="966">
     <w:name w:val="Footer Char"/>
-    <w:basedOn w:val="876"/>
-    <w:link w:val="903"/>
+    <w:basedOn w:val="938"/>
+    <w:link w:val="965"/>
     <w:uiPriority w:val="99"/>
     <w:pPr>
       <w:pBdr/>
@@ -58361,10 +58415,10 @@
       <w:ind/>
     </w:pPr>
   </w:style>
-  <w:style w:type="paragraph" w:styleId="905">
+  <w:style w:type="paragraph" w:styleId="967">
     <w:name w:val="Caption"/>
-    <w:basedOn w:val="926"/>
-    <w:next w:val="926"/>
+    <w:basedOn w:val="988"/>
+    <w:next w:val="988"/>
     <w:uiPriority w:val="35"/>
     <w:unhideWhenUsed/>
     <w:qFormat/>
@@ -58383,10 +58437,10 @@
       <w:szCs w:val="18"/>
     </w:rPr>
   </w:style>
-  <w:style w:type="paragraph" w:styleId="906">
+  <w:style w:type="paragraph" w:styleId="968">
     <w:name w:val="footnote text"/>
-    <w:basedOn w:val="926"/>
-    <w:link w:val="907"/>
+    <w:basedOn w:val="988"/>
+    <w:link w:val="969"/>
     <w:uiPriority w:val="99"/>
     <w:semiHidden/>
     <w:unhideWhenUsed/>
@@ -58400,10 +58454,10 @@
       <w:szCs w:val="20"/>
     </w:rPr>
   </w:style>
-  <w:style w:type="character" w:styleId="907">
+  <w:style w:type="character" w:styleId="969">
     <w:name w:val="Footnote Text Char"/>
-    <w:basedOn w:val="876"/>
-    <w:link w:val="906"/>
+    <w:basedOn w:val="938"/>
+    <w:link w:val="968"/>
     <w:uiPriority w:val="99"/>
     <w:semiHidden/>
     <w:pPr>
@@ -58416,9 +58470,9 @@
       <w:szCs w:val="20"/>
     </w:rPr>
   </w:style>
-  <w:style w:type="character" w:styleId="908">
+  <w:style w:type="character" w:styleId="970">
     <w:name w:val="footnote reference"/>
-    <w:basedOn w:val="876"/>
+    <w:basedOn w:val="938"/>
     <w:uiPriority w:val="99"/>
     <w:semiHidden/>
     <w:unhideWhenUsed/>
@@ -58431,10 +58485,10 @@
       <w:vertAlign w:val="superscript"/>
     </w:rPr>
   </w:style>
-  <w:style w:type="paragraph" w:styleId="909">
+  <w:style w:type="paragraph" w:styleId="971">
     <w:name w:val="endnote text"/>
-    <w:basedOn w:val="926"/>
-    <w:link w:val="910"/>
+    <w:basedOn w:val="988"/>
+    <w:link w:val="972"/>
     <w:uiPriority w:val="99"/>
     <w:semiHidden/>
     <w:unhideWhenUsed/>
@@ -58448,10 +58502,10 @@
       <w:szCs w:val="20"/>
     </w:rPr>
   </w:style>
-  <w:style w:type="character" w:styleId="910">
+  <w:style w:type="character" w:styleId="972">
     <w:name w:val="Endnote Text Char"/>
-    <w:basedOn w:val="876"/>
-    <w:link w:val="909"/>
+    <w:basedOn w:val="938"/>
+    <w:link w:val="971"/>
     <w:uiPriority w:val="99"/>
     <w:semiHidden/>
     <w:pPr>
@@ -58464,9 +58518,9 @@
       <w:szCs w:val="20"/>
     </w:rPr>
   </w:style>
-  <w:style w:type="character" w:styleId="911">
+  <w:style w:type="character" w:styleId="973">
     <w:name w:val="endnote reference"/>
-    <w:basedOn w:val="876"/>
+    <w:basedOn w:val="938"/>
     <w:uiPriority w:val="99"/>
     <w:semiHidden/>
     <w:unhideWhenUsed/>
@@ -58479,9 +58533,9 @@
       <w:vertAlign w:val="superscript"/>
     </w:rPr>
   </w:style>
-  <w:style w:type="character" w:styleId="912">
+  <w:style w:type="character" w:styleId="974">
     <w:name w:val="Hyperlink"/>
-    <w:basedOn w:val="876"/>
+    <w:basedOn w:val="938"/>
     <w:uiPriority w:val="99"/>
     <w:unhideWhenUsed/>
     <w:pPr>
@@ -58494,9 +58548,9 @@
       <w:u w:val="single"/>
     </w:rPr>
   </w:style>
-  <w:style w:type="character" w:styleId="913">
+  <w:style w:type="character" w:styleId="975">
     <w:name w:val="FollowedHyperlink"/>
-    <w:basedOn w:val="876"/>
+    <w:basedOn w:val="938"/>
     <w:uiPriority w:val="99"/>
     <w:semiHidden/>
     <w:unhideWhenUsed/>
@@ -58510,10 +58564,10 @@
       <w:u w:val="single"/>
     </w:rPr>
   </w:style>
-  <w:style w:type="paragraph" w:styleId="914">
+  <w:style w:type="paragraph" w:styleId="976">
     <w:name w:val="toc 1"/>
-    <w:basedOn w:val="926"/>
-    <w:next w:val="926"/>
+    <w:basedOn w:val="988"/>
+    <w:next w:val="988"/>
     <w:uiPriority w:val="39"/>
     <w:unhideWhenUsed/>
     <w:pPr>
@@ -58522,10 +58576,10 @@
       <w:ind/>
     </w:pPr>
   </w:style>
-  <w:style w:type="paragraph" w:styleId="915">
+  <w:style w:type="paragraph" w:styleId="977">
     <w:name w:val="toc 2"/>
-    <w:basedOn w:val="926"/>
-    <w:next w:val="926"/>
+    <w:basedOn w:val="988"/>
+    <w:next w:val="988"/>
     <w:uiPriority w:val="39"/>
     <w:unhideWhenUsed/>
     <w:pPr>
@@ -58534,10 +58588,10 @@
       <w:ind w:left="220"/>
     </w:pPr>
   </w:style>
-  <w:style w:type="paragraph" w:styleId="916">
+  <w:style w:type="paragraph" w:styleId="978">
     <w:name w:val="toc 3"/>
-    <w:basedOn w:val="926"/>
-    <w:next w:val="926"/>
+    <w:basedOn w:val="988"/>
+    <w:next w:val="988"/>
     <w:uiPriority w:val="39"/>
     <w:unhideWhenUsed/>
     <w:pPr>
@@ -58546,10 +58600,10 @@
       <w:ind w:left="440"/>
     </w:pPr>
   </w:style>
-  <w:style w:type="paragraph" w:styleId="917">
+  <w:style w:type="paragraph" w:styleId="979">
     <w:name w:val="toc 4"/>
-    <w:basedOn w:val="926"/>
-    <w:next w:val="926"/>
+    <w:basedOn w:val="988"/>
+    <w:next w:val="988"/>
     <w:uiPriority w:val="39"/>
     <w:unhideWhenUsed/>
     <w:pPr>
@@ -58558,10 +58612,10 @@
       <w:ind w:left="660"/>
     </w:pPr>
   </w:style>
-  <w:style w:type="paragraph" w:styleId="918">
+  <w:style w:type="paragraph" w:styleId="980">
     <w:name w:val="toc 5"/>
-    <w:basedOn w:val="926"/>
-    <w:next w:val="926"/>
+    <w:basedOn w:val="988"/>
+    <w:next w:val="988"/>
     <w:uiPriority w:val="39"/>
     <w:unhideWhenUsed/>
     <w:pPr>
@@ -58570,10 +58624,10 @@
       <w:ind w:left="880"/>
     </w:pPr>
   </w:style>
-  <w:style w:type="paragraph" w:styleId="919">
+  <w:style w:type="paragraph" w:styleId="981">
     <w:name w:val="toc 6"/>
-    <w:basedOn w:val="926"/>
-    <w:next w:val="926"/>
+    <w:basedOn w:val="988"/>
+    <w:next w:val="988"/>
     <w:uiPriority w:val="39"/>
     <w:unhideWhenUsed/>
     <w:pPr>
@@ -58582,10 +58636,10 @@
       <w:ind w:left="1100"/>
     </w:pPr>
   </w:style>
-  <w:style w:type="paragraph" w:styleId="920">
+  <w:style w:type="paragraph" w:styleId="982">
     <w:name w:val="toc 7"/>
-    <w:basedOn w:val="926"/>
-    <w:next w:val="926"/>
+    <w:basedOn w:val="988"/>
+    <w:next w:val="988"/>
     <w:uiPriority w:val="39"/>
     <w:unhideWhenUsed/>
     <w:pPr>
@@ -58594,10 +58648,10 @@
       <w:ind w:left="1320"/>
     </w:pPr>
   </w:style>
-  <w:style w:type="paragraph" w:styleId="921">
+  <w:style w:type="paragraph" w:styleId="983">
     <w:name w:val="toc 8"/>
-    <w:basedOn w:val="926"/>
-    <w:next w:val="926"/>
+    <w:basedOn w:val="988"/>
+    <w:next w:val="988"/>
     <w:uiPriority w:val="39"/>
     <w:unhideWhenUsed/>
     <w:pPr>
@@ -58606,10 +58660,10 @@
       <w:ind w:left="1540"/>
     </w:pPr>
   </w:style>
-  <w:style w:type="paragraph" w:styleId="922">
+  <w:style w:type="paragraph" w:styleId="984">
     <w:name w:val="toc 9"/>
-    <w:basedOn w:val="926"/>
-    <w:next w:val="926"/>
+    <w:basedOn w:val="988"/>
+    <w:next w:val="988"/>
     <w:uiPriority w:val="39"/>
     <w:unhideWhenUsed/>
     <w:pPr>
@@ -58618,9 +58672,9 @@
       <w:ind w:left="1760"/>
     </w:pPr>
   </w:style>
-  <w:style w:type="character" w:styleId="923">
+  <w:style w:type="character" w:styleId="985">
     <w:name w:val="Placeholder Text"/>
-    <w:basedOn w:val="876"/>
+    <w:basedOn w:val="938"/>
     <w:uiPriority w:val="99"/>
     <w:semiHidden/>
     <w:pPr>
@@ -58632,7 +58686,7 @@
       <w:color w:val="666666"/>
     </w:rPr>
   </w:style>
-  <w:style w:type="paragraph" w:styleId="924">
+  <w:style w:type="paragraph" w:styleId="986">
     <w:name w:val="TOC Heading"/>
     <w:uiPriority w:val="39"/>
     <w:unhideWhenUsed/>
@@ -58642,10 +58696,10 @@
       <w:ind/>
     </w:pPr>
   </w:style>
-  <w:style w:type="paragraph" w:styleId="925">
+  <w:style w:type="paragraph" w:styleId="987">
     <w:name w:val="table of figures"/>
-    <w:basedOn w:val="926"/>
-    <w:next w:val="926"/>
+    <w:basedOn w:val="988"/>
+    <w:next w:val="988"/>
     <w:uiPriority w:val="99"/>
     <w:unhideWhenUsed/>
     <w:pPr>
@@ -58654,7 +58708,7 @@
       <w:ind/>
     </w:pPr>
   </w:style>
-  <w:style w:type="paragraph" w:styleId="926" w:default="1">
+  <w:style w:type="paragraph" w:styleId="988" w:default="1">
     <w:name w:val="Normal"/>
     <w:qFormat/>
     <w:pPr>
@@ -58674,7 +58728,7 @@
       <w:sz w:val="24"/>
     </w:rPr>
   </w:style>
-  <w:style w:type="table" w:styleId="927" w:default="1">
+  <w:style w:type="table" w:styleId="989" w:default="1">
     <w:name w:val="Normal Table"/>
     <w:uiPriority w:val="99"/>
     <w:semiHidden/>
@@ -58867,7 +58921,7 @@
       </w:tcPr>
     </w:tblStylePr>
   </w:style>
-  <w:style w:type="numbering" w:styleId="928" w:default="1">
+  <w:style w:type="numbering" w:styleId="990" w:default="1">
     <w:name w:val="No List"/>
     <w:uiPriority w:val="99"/>
     <w:semiHidden/>
@@ -58878,9 +58932,9 @@
       <w:ind/>
     </w:pPr>
   </w:style>
-  <w:style w:type="paragraph" w:styleId="929">
+  <w:style w:type="paragraph" w:styleId="991">
     <w:name w:val="No Spacing"/>
-    <w:basedOn w:val="926"/>
+    <w:basedOn w:val="988"/>
     <w:uiPriority w:val="1"/>
     <w:qFormat/>
     <w:pPr>
@@ -58889,9 +58943,9 @@
       <w:ind/>
     </w:pPr>
   </w:style>
-  <w:style w:type="paragraph" w:styleId="930">
+  <w:style w:type="paragraph" w:styleId="992">
     <w:name w:val="List Paragraph"/>
-    <w:basedOn w:val="926"/>
+    <w:basedOn w:val="988"/>
     <w:uiPriority w:val="34"/>
     <w:qFormat/>
     <w:pPr>

</xml_diff>